<commit_message>
Update all files and changes
</commit_message>
<xml_diff>
--- a/Task_2_App/Task2_Methodology_Report.docx
+++ b/Task_2_App/Task2_Methodology_Report.docx
@@ -1,6 +1,6 @@
 
 <file path=word/document.xml><?xml version="1.0" encoding="utf-8"?>
-<w:document xmlns:wpc="http://schemas.microsoft.com/office/word/2010/wordprocessingCanvas" xmlns:cx="http://schemas.microsoft.com/office/drawing/2014/chartex" xmlns:cx1="http://schemas.microsoft.com/office/drawing/2015/9/8/chartex" xmlns:cx2="http://schemas.microsoft.com/office/drawing/2015/10/21/chartex" xmlns:cx3="http://schemas.microsoft.com/office/drawing/2016/5/9/chartex" xmlns:cx4="http://schemas.microsoft.com/office/drawing/2016/5/10/chartex" xmlns:cx5="http://schemas.microsoft.com/office/drawing/2016/5/11/chartex" xmlns:cx6="http://schemas.microsoft.com/office/drawing/2016/5/12/chartex" xmlns:cx7="http://schemas.microsoft.com/office/drawing/2016/5/13/chartex" xmlns:cx8="http://schemas.microsoft.com/office/drawing/2016/5/14/chartex" xmlns:mc="http://schemas.openxmlformats.org/markup-compatibility/2006" xmlns:aink="http://schemas.microsoft.com/office/drawing/2016/ink" xmlns:am3d="http://schemas.microsoft.com/office/drawing/2017/model3d" xmlns:o="urn:schemas-microsoft-com:office:office" xmlns:oel="http://schemas.microsoft.com/office/2019/extlst" xmlns:r="http://schemas.openxmlformats.org/officeDocument/2006/relationships" xmlns:m="http://schemas.openxmlformats.org/officeDocument/2006/math" xmlns:v="urn:schemas-microsoft-com:vml" xmlns:wp14="http://schemas.microsoft.com/office/word/2010/wordprocessingDrawing" xmlns:wp="http://schemas.openxmlformats.org/drawingml/2006/wordprocessingDrawing" xmlns:w10="urn:schemas-microsoft-com:office:word" xmlns:w="http://schemas.openxmlformats.org/wordprocessingml/2006/main" xmlns:w14="http://schemas.microsoft.com/office/word/2010/wordml" xmlns:w15="http://schemas.microsoft.com/office/word/2012/wordml" xmlns:w16cex="http://schemas.microsoft.com/office/word/2018/wordml/cex" xmlns:w16cid="http://schemas.microsoft.com/office/word/2016/wordml/cid" xmlns:w16="http://schemas.microsoft.com/office/word/2018/wordml" xmlns:w16du="http://schemas.microsoft.com/office/word/2023/wordml/word16du" xmlns:w16sdtdh="http://schemas.microsoft.com/office/word/2020/wordml/sdtdatahash" xmlns:w16sdtfl="http://schemas.microsoft.com/office/word/2024/wordml/sdtformatlock" xmlns:w16se="http://schemas.microsoft.com/office/word/2015/wordml/symex" xmlns:wpg="http://schemas.microsoft.com/office/word/2010/wordprocessingGroup" xmlns:wpi="http://schemas.microsoft.com/office/word/2010/wordprocessingInk" xmlns:wne="http://schemas.microsoft.com/office/word/2006/wordml" xmlns:wps="http://schemas.microsoft.com/office/word/2010/wordprocessingShape" mc:Ignorable="w14 w15 w16se w16cid w16 w16cex w16sdtdh w16sdtfl w16du wp14">
+<w:document xmlns:wpc="http://schemas.microsoft.com/office/word/2010/wordprocessingCanvas" xmlns:cx="http://schemas.microsoft.com/office/drawing/2014/chartex" xmlns:cx1="http://schemas.microsoft.com/office/drawing/2015/9/8/chartex" xmlns:cx2="http://schemas.microsoft.com/office/drawing/2015/10/21/chartex" xmlns:cx3="http://schemas.microsoft.com/office/drawing/2016/5/9/chartex" xmlns:cx4="http://schemas.microsoft.com/office/drawing/2016/5/10/chartex" xmlns:cx5="http://schemas.microsoft.com/office/drawing/2016/5/11/chartex" xmlns:cx6="http://schemas.microsoft.com/office/drawing/2016/5/12/chartex" xmlns:cx7="http://schemas.microsoft.com/office/drawing/2016/5/13/chartex" xmlns:cx8="http://schemas.microsoft.com/office/drawing/2016/5/14/chartex" xmlns:mc="http://schemas.openxmlformats.org/markup-compatibility/2006" xmlns:aink="http://schemas.microsoft.com/office/drawing/2016/ink" xmlns:am3d="http://schemas.microsoft.com/office/drawing/2017/model3d" xmlns:o="urn:schemas-microsoft-com:office:office" xmlns:oel="http://schemas.microsoft.com/office/2019/extlst" xmlns:r="http://schemas.openxmlformats.org/officeDocument/2006/relationships" xmlns:m="http://schemas.openxmlformats.org/officeDocument/2006/math" xmlns:v="urn:schemas-microsoft-com:vml" xmlns:wp14="http://schemas.microsoft.com/office/word/2010/wordprocessingDrawing" xmlns:wp="http://schemas.openxmlformats.org/drawingml/2006/wordprocessingDrawing" xmlns:w10="urn:schemas-microsoft-com:office:word" xmlns:w="http://schemas.openxmlformats.org/wordprocessingml/2006/main" xmlns:w14="http://schemas.microsoft.com/office/word/2010/wordml" xmlns:w15="http://schemas.microsoft.com/office/word/2012/wordml" xmlns:w16cei="http://schemas.microsoft.com/office/word/2026/wordml/cei" xmlns:w16cex="http://schemas.microsoft.com/office/word/2018/wordml/cex" xmlns:w16cid="http://schemas.microsoft.com/office/word/2016/wordml/cid" xmlns:w16="http://schemas.microsoft.com/office/word/2018/wordml" xmlns:w16du="http://schemas.microsoft.com/office/word/2023/wordml/word16du" xmlns:w16sdtdh="http://schemas.microsoft.com/office/word/2020/wordml/sdtdatahash" xmlns:w16sdtfl="http://schemas.microsoft.com/office/word/2024/wordml/sdtformatlock" xmlns:w16se="http://schemas.microsoft.com/office/word/2015/wordml/symex" xmlns:wpg="http://schemas.microsoft.com/office/word/2010/wordprocessingGroup" xmlns:wpi="http://schemas.microsoft.com/office/word/2010/wordprocessingInk" xmlns:wne="http://schemas.microsoft.com/office/word/2006/wordml" xmlns:wps="http://schemas.microsoft.com/office/word/2010/wordprocessingShape" mc:Ignorable="w14 w15 w16se w16cid w16 w16cex w16sdtdh w16sdtfl w16du wp14">
   <w:body>
     <w:p>
       <w:pPr>
@@ -28,67 +28,6 @@
         </w:rPr>
         <w:t>Methodology Report</w:t>
       </w:r>
-    </w:p>
-    <w:p>
-      <w:pPr>
-        <w:spacing w:before="400"/>
-        <w:jc w:val="center"/>
-      </w:pPr>
-      <w:r>
-        <w:rPr>
-          <w:i/>
-          <w:color w:val="444444"/>
-        </w:rPr>
-        <w:t>AI Assistant</w:t>
-      </w:r>
-      <w:r>
-        <w:rPr>
-          <w:i/>
-          <w:color w:val="444444"/>
-        </w:rPr>
-        <w:t xml:space="preserve"> </w:t>
-      </w:r>
-      <w:proofErr w:type="gramStart"/>
-      <w:r>
-        <w:rPr>
-          <w:i/>
-          <w:color w:val="444444"/>
-        </w:rPr>
-        <w:t>For</w:t>
-      </w:r>
-      <w:proofErr w:type="gramEnd"/>
-      <w:r>
-        <w:rPr>
-          <w:i/>
-          <w:color w:val="444444"/>
-        </w:rPr>
-        <w:t xml:space="preserve"> Active </w:t>
-      </w:r>
-      <w:proofErr w:type="gramStart"/>
-      <w:r>
-        <w:rPr>
-          <w:i/>
-          <w:color w:val="444444"/>
-        </w:rPr>
-        <w:t>Guidance</w:t>
-      </w:r>
-      <w:r>
-        <w:rPr>
-          <w:i/>
-          <w:color w:val="444444"/>
-        </w:rPr>
-        <w:t xml:space="preserve">  |</w:t>
-      </w:r>
-      <w:proofErr w:type="gramEnd"/>
-      <w:r>
-        <w:rPr>
-          <w:i/>
-          <w:color w:val="444444"/>
-        </w:rPr>
-        <w:t xml:space="preserve">  July 2026</w:t>
-      </w:r>
-    </w:p>
-    <w:p>
       <w:r>
         <w:br w:type="page"/>
       </w:r>
@@ -338,14 +277,123 @@
     </w:p>
     <w:p>
       <w:pPr>
+        <w:pStyle w:val="ListBullet"/>
+        <w:spacing w:before="20" w:after="40"/>
+        <w:ind w:left="283"/>
+      </w:pPr>
+      <w:r>
+        <w:rPr>
+          <w:color w:val="000000"/>
+        </w:rPr>
+        <w:t>What are the scanning protocols for different regions and veins (from the book)</w:t>
+      </w:r>
+    </w:p>
+    <w:p>
+      <w:pPr>
         <w:spacing w:before="40" w:after="80"/>
-      </w:pPr>
-      <w:r>
         <w:rPr>
           <w:color w:val="000000"/>
         </w:rPr>
-        <w:t>From all of this, it produces a short instruction — 12 words or fewer — telling the surgeon exactly where to move the probe next. This is not a chatbot or a reference guide. It is a live, adaptive navigation assistant that adapts to the specific findings of the current patient.</w:t>
-      </w:r>
+      </w:pPr>
+      <w:r>
+        <w:rPr>
+          <w:color w:val="000000"/>
+        </w:rPr>
+        <w:t xml:space="preserve">From all of this, it produces a short instruction </w:t>
+      </w:r>
+      <w:r>
+        <w:rPr>
+          <w:color w:val="000000"/>
+        </w:rPr>
+        <w:t>of</w:t>
+      </w:r>
+      <w:r>
+        <w:rPr>
+          <w:color w:val="000000"/>
+        </w:rPr>
+        <w:t xml:space="preserve"> 12 words or fewer</w:t>
+      </w:r>
+      <w:r>
+        <w:rPr>
+          <w:color w:val="000000"/>
+        </w:rPr>
+        <w:t>,</w:t>
+      </w:r>
+      <w:r>
+        <w:rPr>
+          <w:color w:val="000000"/>
+        </w:rPr>
+        <w:t xml:space="preserve"> telling the surgeon exactly where to move the probe next. This is not a chatbot or a reference guide. It is a live, adaptive navigation assistant that adapts to the specific findings of the current patient.</w:t>
+      </w:r>
+    </w:p>
+    <w:p>
+      <w:pPr>
+        <w:spacing w:before="40" w:after="80"/>
+        <w:rPr>
+          <w:color w:val="000000"/>
+        </w:rPr>
+      </w:pPr>
+    </w:p>
+    <w:p>
+      <w:pPr>
+        <w:spacing w:before="40" w:after="80"/>
+        <w:rPr>
+          <w:color w:val="000000"/>
+        </w:rPr>
+      </w:pPr>
+    </w:p>
+    <w:p>
+      <w:pPr>
+        <w:spacing w:before="40" w:after="80"/>
+        <w:rPr>
+          <w:color w:val="000000"/>
+        </w:rPr>
+      </w:pPr>
+    </w:p>
+    <w:p>
+      <w:pPr>
+        <w:spacing w:before="40" w:after="80"/>
+        <w:rPr>
+          <w:color w:val="000000"/>
+        </w:rPr>
+      </w:pPr>
+    </w:p>
+    <w:p>
+      <w:pPr>
+        <w:spacing w:before="40" w:after="80"/>
+        <w:rPr>
+          <w:color w:val="000000"/>
+        </w:rPr>
+      </w:pPr>
+    </w:p>
+    <w:p>
+      <w:pPr>
+        <w:spacing w:before="40" w:after="80"/>
+        <w:rPr>
+          <w:color w:val="000000"/>
+        </w:rPr>
+      </w:pPr>
+    </w:p>
+    <w:p>
+      <w:pPr>
+        <w:spacing w:before="40" w:after="80"/>
+        <w:rPr>
+          <w:color w:val="000000"/>
+        </w:rPr>
+      </w:pPr>
+    </w:p>
+    <w:p>
+      <w:pPr>
+        <w:spacing w:before="40" w:after="80"/>
+        <w:rPr>
+          <w:color w:val="000000"/>
+        </w:rPr>
+      </w:pPr>
+    </w:p>
+    <w:p>
+      <w:pPr>
+        <w:spacing w:before="40" w:after="80"/>
+      </w:pPr>
     </w:p>
     <w:p>
       <w:pPr>
@@ -360,6 +408,7 @@
           <w:color w:val="1F3964"/>
           <w:sz w:val="32"/>
         </w:rPr>
+        <w:lastRenderedPageBreak/>
         <w:t>2. Clinical Background</w:t>
       </w:r>
     </w:p>
@@ -574,7 +623,33 @@
               <w:rPr>
                 <w:sz w:val="20"/>
               </w:rPr>
-              <w:t>Great Saphenous Vein (GSV) — groin to ankle, medial side. Small Saphenous Vein (SSV) — popliteal to ankle, posterior side. Identified on ultrasound by the "saphenous eye" — N2 sits inside the fascial compartment.</w:t>
+              <w:t xml:space="preserve">Great Saphenous Vein (GSV) — groin to ankle, medial side. Small Saphenous Vein (SSV) — popliteal to ankle, posterior side. Identified on ultrasound by the "saphenous </w:t>
+            </w:r>
+            <w:proofErr w:type="gramStart"/>
+            <w:r>
+              <w:rPr>
+                <w:sz w:val="20"/>
+              </w:rPr>
+              <w:t>eye" —</w:t>
+            </w:r>
+            <w:proofErr w:type="gramEnd"/>
+            <w:r>
+              <w:rPr>
+                <w:sz w:val="20"/>
+              </w:rPr>
+              <w:t xml:space="preserve"> N2 sits inside </w:t>
+            </w:r>
+            <w:r>
+              <w:rPr>
+                <w:sz w:val="20"/>
+              </w:rPr>
+              <w:t xml:space="preserve">or within </w:t>
+            </w:r>
+            <w:r>
+              <w:rPr>
+                <w:sz w:val="20"/>
+              </w:rPr>
+              <w:t>the fascial compartment.</w:t>
             </w:r>
           </w:p>
         </w:tc>
@@ -650,7 +725,6 @@
         </w:tc>
       </w:tr>
     </w:tbl>
-    <w:p/>
     <w:p>
       <w:pPr>
         <w:spacing w:before="40" w:after="80"/>
@@ -659,7 +733,33 @@
         <w:rPr>
           <w:color w:val="000000"/>
         </w:rPr>
-        <w:t>Under normal conditions, blood flows inward: N3 → N2 → N1. In varicose vein disease, this flow reverses at specific points, creating abnormal circuits that feed the varicosities.</w:t>
+        <w:t xml:space="preserve">Under normal conditions, blood flows inward: N3 → N2 → N1. In varicose vein disease, this flow </w:t>
+      </w:r>
+      <w:proofErr w:type="gramStart"/>
+      <w:r>
+        <w:rPr>
+          <w:color w:val="000000"/>
+        </w:rPr>
+        <w:t>reverses</w:t>
+      </w:r>
+      <w:proofErr w:type="gramEnd"/>
+      <w:r>
+        <w:rPr>
+          <w:color w:val="000000"/>
+        </w:rPr>
+        <w:t xml:space="preserve"> at specific points, creating </w:t>
+      </w:r>
+      <w:r>
+        <w:rPr>
+          <w:color w:val="000000"/>
+        </w:rPr>
+        <w:t>abnormal blood flow which causes varicose veins</w:t>
+      </w:r>
+      <w:r>
+        <w:rPr>
+          <w:color w:val="000000"/>
+        </w:rPr>
+        <w:t>.</w:t>
       </w:r>
     </w:p>
     <w:p>
@@ -813,21 +913,21 @@
               <w:rPr>
                 <w:sz w:val="20"/>
               </w:rPr>
-              <w:t>EP N1→N2 (deep enters trunk)</w:t>
+              <w:t xml:space="preserve">EP N1→N2 </w:t>
             </w:r>
             <w:r>
               <w:rPr>
                 <w:sz w:val="20"/>
               </w:rPr>
               <w:br/>
-              <w:t>EP N1→N3 (deep enters tributary)</w:t>
+              <w:t>EP N1→N3</w:t>
             </w:r>
             <w:r>
               <w:rPr>
                 <w:sz w:val="20"/>
               </w:rPr>
               <w:br/>
-              <w:t>EP N2→N3 (trunk escapes to tributary)</w:t>
+              <w:t xml:space="preserve">EP N2→N3 </w:t>
             </w:r>
           </w:p>
         </w:tc>
@@ -868,7 +968,19 @@
               <w:rPr>
                 <w:sz w:val="20"/>
               </w:rPr>
-              <w:t>Superficial → Deep (return path)</w:t>
+              <w:t xml:space="preserve">Superficial → Deep (return </w:t>
+            </w:r>
+            <w:r>
+              <w:rPr>
+                <w:sz w:val="20"/>
+              </w:rPr>
+              <w:t xml:space="preserve">to normal </w:t>
+            </w:r>
+            <w:r>
+              <w:rPr>
+                <w:sz w:val="20"/>
+              </w:rPr>
+              <w:t>path)</w:t>
             </w:r>
           </w:p>
         </w:tc>
@@ -881,93 +993,21 @@
               <w:rPr>
                 <w:sz w:val="20"/>
               </w:rPr>
-              <w:t>RP N2→N1 (trunk reflux back to deep)</w:t>
+              <w:t xml:space="preserve">RP N2→N1 </w:t>
             </w:r>
             <w:r>
               <w:rPr>
                 <w:sz w:val="20"/>
               </w:rPr>
               <w:br/>
-              <w:t>RP N3→N1 (</w:t>
-            </w:r>
-            <w:r>
-              <w:rPr>
-                <w:sz w:val="20"/>
-              </w:rPr>
-              <w:t xml:space="preserve">from </w:t>
-            </w:r>
-            <w:r>
-              <w:rPr>
-                <w:sz w:val="20"/>
-              </w:rPr>
-              <w:t>tributary</w:t>
-            </w:r>
-            <w:r>
-              <w:rPr>
-                <w:sz w:val="20"/>
-              </w:rPr>
-              <w:t>, the blood</w:t>
-            </w:r>
-            <w:r>
-              <w:rPr>
-                <w:sz w:val="20"/>
-              </w:rPr>
-              <w:t xml:space="preserve"> re-enters deep</w:t>
-            </w:r>
-            <w:r>
-              <w:rPr>
-                <w:sz w:val="20"/>
-              </w:rPr>
-              <w:t xml:space="preserve"> system</w:t>
-            </w:r>
-            <w:r>
-              <w:rPr>
-                <w:sz w:val="20"/>
-              </w:rPr>
-              <w:t>)</w:t>
+              <w:t xml:space="preserve">RP N3→N1 </w:t>
             </w:r>
             <w:r>
               <w:rPr>
                 <w:sz w:val="20"/>
               </w:rPr>
               <w:br/>
-              <w:t>RP N3→N2 (</w:t>
-            </w:r>
-            <w:r>
-              <w:rPr>
-                <w:sz w:val="20"/>
-              </w:rPr>
-              <w:t xml:space="preserve">from </w:t>
-            </w:r>
-            <w:r>
-              <w:rPr>
-                <w:sz w:val="20"/>
-              </w:rPr>
-              <w:t>tributary</w:t>
-            </w:r>
-            <w:r>
-              <w:rPr>
-                <w:sz w:val="20"/>
-              </w:rPr>
-              <w:t>, blood</w:t>
-            </w:r>
-            <w:r>
-              <w:rPr>
-                <w:sz w:val="20"/>
-              </w:rPr>
-              <w:t xml:space="preserve"> re-enters </w:t>
-            </w:r>
-            <w:r>
-              <w:rPr>
-                <w:sz w:val="20"/>
-              </w:rPr>
-              <w:t>the GSV</w:t>
-            </w:r>
-            <w:r>
-              <w:rPr>
-                <w:sz w:val="20"/>
-              </w:rPr>
-              <w:t>)</w:t>
+              <w:t xml:space="preserve">RP N3→N2 </w:t>
             </w:r>
           </w:p>
         </w:tc>
@@ -982,7 +1022,27 @@
         <w:rPr>
           <w:color w:val="000000"/>
         </w:rPr>
-        <w:t>A "clip" is a confirmed duplex finding at a specific location on the leg. Position is recorded as posY — a decimal from 0.0 (groin) to 1.0 (ankle).</w:t>
+        <w:t xml:space="preserve">A "clip" is a confirmed duplex finding at a specific location on the leg. Position is recorded as </w:t>
+      </w:r>
+      <w:proofErr w:type="spellStart"/>
+      <w:r>
+        <w:rPr>
+          <w:color w:val="000000"/>
+        </w:rPr>
+        <w:t>posY</w:t>
+      </w:r>
+      <w:proofErr w:type="spellEnd"/>
+      <w:r>
+        <w:rPr>
+          <w:color w:val="000000"/>
+        </w:rPr>
+        <w:t xml:space="preserve"> which is </w:t>
+      </w:r>
+      <w:r>
+        <w:rPr>
+          <w:color w:val="000000"/>
+        </w:rPr>
+        <w:t>a decimal from 0.0 (groin) to 1.0 (ankle).</w:t>
       </w:r>
     </w:p>
     <w:p>
@@ -1022,7 +1082,31 @@
         <w:rPr>
           <w:color w:val="000000"/>
         </w:rPr>
-        <w:t>Quick reference table containing different combinations of EP and RP clips define the six CHIVA shunt types:</w:t>
+        <w:t xml:space="preserve">Quick reference table containing </w:t>
+      </w:r>
+      <w:r>
+        <w:rPr>
+          <w:color w:val="000000"/>
+        </w:rPr>
+        <w:t xml:space="preserve">most common different </w:t>
+      </w:r>
+      <w:r>
+        <w:rPr>
+          <w:color w:val="000000"/>
+        </w:rPr>
+        <w:t xml:space="preserve">combinations of EP and RP clips </w:t>
+      </w:r>
+      <w:r>
+        <w:rPr>
+          <w:color w:val="000000"/>
+        </w:rPr>
+        <w:t xml:space="preserve">that </w:t>
+      </w:r>
+      <w:r>
+        <w:rPr>
+          <w:color w:val="000000"/>
+        </w:rPr>
+        <w:t>define the six CHIVA shunt types:</w:t>
       </w:r>
     </w:p>
     <w:tbl>
@@ -1116,7 +1200,19 @@
                 <w:sz w:val="20"/>
               </w:rPr>
               <w:br/>
-              <w:t>(No N3)</w:t>
+              <w:t>(No N3</w:t>
+            </w:r>
+            <w:r>
+              <w:rPr>
+                <w:sz w:val="20"/>
+              </w:rPr>
+              <w:t>involved</w:t>
+            </w:r>
+            <w:r>
+              <w:rPr>
+                <w:sz w:val="20"/>
+              </w:rPr>
+              <w:t>)</w:t>
             </w:r>
           </w:p>
         </w:tc>
@@ -1343,6 +1439,12 @@
                 <w:sz w:val="20"/>
               </w:rPr>
               <w:br/>
+            </w:r>
+            <w:r>
+              <w:rPr>
+                <w:sz w:val="20"/>
+              </w:rPr>
+              <w:lastRenderedPageBreak/>
               <w:t>(No RP N2→N1)</w:t>
             </w:r>
           </w:p>
@@ -1357,6 +1459,7 @@
               <w:rPr>
                 <w:sz w:val="20"/>
               </w:rPr>
+              <w:lastRenderedPageBreak/>
               <w:t>Complex loop: N1→N3→N2→N3→N1. Trunk is in the middle of the circuit.</w:t>
             </w:r>
           </w:p>
@@ -1372,6 +1475,7 @@
               <w:rPr>
                 <w:sz w:val="20"/>
               </w:rPr>
+              <w:lastRenderedPageBreak/>
               <w:t>Type 6</w:t>
             </w:r>
           </w:p>
@@ -1411,39 +1515,17 @@
         </w:tc>
       </w:tr>
     </w:tbl>
-    <w:p/>
     <w:p>
       <w:pPr>
         <w:spacing w:before="240" w:after="60"/>
+      </w:pPr>
+      <w:proofErr w:type="gramStart"/>
+      <w:r>
         <w:rPr>
           <w:b/>
           <w:color w:val="1F747D"/>
           <w:sz w:val="26"/>
         </w:rPr>
-      </w:pPr>
-    </w:p>
-    <w:p>
-      <w:pPr>
-        <w:spacing w:before="240" w:after="60"/>
-        <w:rPr>
-          <w:b/>
-          <w:color w:val="1F747D"/>
-          <w:sz w:val="26"/>
-        </w:rPr>
-      </w:pPr>
-    </w:p>
-    <w:p>
-      <w:pPr>
-        <w:spacing w:before="240" w:after="60"/>
-      </w:pPr>
-      <w:proofErr w:type="gramStart"/>
-      <w:r>
-        <w:rPr>
-          <w:b/>
-          <w:color w:val="1F747D"/>
-          <w:sz w:val="26"/>
-        </w:rPr>
-        <w:lastRenderedPageBreak/>
         <w:t>2.4  The</w:t>
       </w:r>
       <w:proofErr w:type="gramEnd"/>
@@ -1781,18 +1863,45 @@
         </w:tc>
       </w:tr>
     </w:tbl>
-    <w:p/>
     <w:p>
       <w:pPr>
         <w:spacing w:before="240" w:after="60"/>
       </w:pPr>
+      <w:proofErr w:type="gramStart"/>
       <w:r>
         <w:rPr>
           <w:b/>
           <w:color w:val="1F747D"/>
           <w:sz w:val="26"/>
         </w:rPr>
-        <w:t>2.5  Anatomical Positions (posY Landmarks)</w:t>
+        <w:t>2.5  Anatomical</w:t>
+      </w:r>
+      <w:proofErr w:type="gramEnd"/>
+      <w:r>
+        <w:rPr>
+          <w:b/>
+          <w:color w:val="1F747D"/>
+          <w:sz w:val="26"/>
+        </w:rPr>
+        <w:t xml:space="preserve"> Positions (</w:t>
+      </w:r>
+      <w:proofErr w:type="spellStart"/>
+      <w:r>
+        <w:rPr>
+          <w:b/>
+          <w:color w:val="1F747D"/>
+          <w:sz w:val="26"/>
+        </w:rPr>
+        <w:t>posY</w:t>
+      </w:r>
+      <w:proofErr w:type="spellEnd"/>
+      <w:r>
+        <w:rPr>
+          <w:b/>
+          <w:color w:val="1F747D"/>
+          <w:sz w:val="26"/>
+        </w:rPr>
+        <w:t xml:space="preserve"> Landmarks)</w:t>
       </w:r>
     </w:p>
     <w:p>
@@ -2204,11 +2313,57 @@
             <w:tcW w:w="5760" w:type="dxa"/>
           </w:tcPr>
           <w:p>
-            <w:r>
-              <w:rPr>
-                <w:sz w:val="20"/>
-              </w:rPr>
-              <w:t>Groq API — Llama 3.3 70B Versatile</w:t>
+            <w:proofErr w:type="spellStart"/>
+            <w:r>
+              <w:rPr>
+                <w:sz w:val="20"/>
+              </w:rPr>
+              <w:t>Groq</w:t>
+            </w:r>
+            <w:proofErr w:type="spellEnd"/>
+            <w:r>
+              <w:rPr>
+                <w:sz w:val="20"/>
+              </w:rPr>
+              <w:t xml:space="preserve"> API — Llama 3.3 70B </w:t>
+            </w:r>
+            <w:proofErr w:type="gramStart"/>
+            <w:r>
+              <w:rPr>
+                <w:sz w:val="20"/>
+              </w:rPr>
+              <w:t>Versatile</w:t>
+            </w:r>
+            <w:r>
+              <w:rPr>
+                <w:sz w:val="20"/>
+              </w:rPr>
+              <w:t xml:space="preserve"> ,</w:t>
+            </w:r>
+            <w:proofErr w:type="gramEnd"/>
+            <w:r>
+              <w:rPr>
+                <w:sz w:val="20"/>
+              </w:rPr>
+              <w:t xml:space="preserve"> O</w:t>
+            </w:r>
+            <w:r>
+              <w:rPr>
+                <w:sz w:val="20"/>
+              </w:rPr>
+              <w:t>penAI</w:t>
+            </w:r>
+            <w:r>
+              <w:rPr>
+                <w:sz w:val="20"/>
+              </w:rPr>
+              <w:t xml:space="preserve"> </w:t>
+            </w:r>
+            <w:r>
+              <w:rPr>
+                <w:sz w:val="20"/>
+              </w:rPr>
+              <w:t>gpt-oss-120b</w:t>
             </w:r>
           </w:p>
         </w:tc>
@@ -2234,11 +2389,31 @@
             <w:shd w:val="clear" w:color="auto" w:fill="EBF3F8"/>
           </w:tcPr>
           <w:p>
-            <w:r>
-              <w:rPr>
-                <w:sz w:val="20"/>
-              </w:rPr>
-              <w:t>Groq API — Llama 4 Scout 17B</w:t>
+            <w:proofErr w:type="spellStart"/>
+            <w:r>
+              <w:rPr>
+                <w:sz w:val="20"/>
+              </w:rPr>
+              <w:t>Groq</w:t>
+            </w:r>
+            <w:proofErr w:type="spellEnd"/>
+            <w:r>
+              <w:rPr>
+                <w:sz w:val="20"/>
+              </w:rPr>
+              <w:t xml:space="preserve"> API —</w:t>
+            </w:r>
+            <w:r>
+              <w:rPr>
+                <w:sz w:val="20"/>
+              </w:rPr>
+              <w:t xml:space="preserve"> Q</w:t>
+            </w:r>
+            <w:r>
+              <w:rPr>
+                <w:sz w:val="20"/>
+              </w:rPr>
+              <w:t>wen3.6-27b</w:t>
             </w:r>
           </w:p>
         </w:tc>
@@ -2420,7 +2595,6 @@
           <w:color w:val="1F747D"/>
           <w:sz w:val="26"/>
         </w:rPr>
-        <w:lastRenderedPageBreak/>
         <w:t>3.2  Three</w:t>
       </w:r>
       <w:proofErr w:type="gramEnd"/>
@@ -3062,6 +3236,7 @@
         <w:rPr>
           <w:color w:val="000000"/>
         </w:rPr>
+        <w:lastRenderedPageBreak/>
         <w:t xml:space="preserve">Because </w:t>
       </w:r>
       <w:r>
@@ -3094,7 +3269,6 @@
         <w:rPr>
           <w:color w:val="000000"/>
         </w:rPr>
-        <w:lastRenderedPageBreak/>
         <w:t>results, i.e.</w:t>
       </w:r>
       <w:r>
@@ -3779,7 +3953,6 @@
           <w:shd w:val="clear" w:color="auto" w:fill="F2F2F2"/>
         </w:rPr>
         <w:br/>
-        <w:t>[    ] Hunterian/lower thigh (0.34–0.47)</w:t>
       </w:r>
       <w:r>
         <w:rPr>
@@ -3788,8 +3961,8 @@
           <w:sz w:val="18"/>
           <w:shd w:val="clear" w:color="auto" w:fill="F2F2F2"/>
         </w:rPr>
-        <w:br/>
-        <w:t>[    ] Popliteal/SPJ (0.48–0.57)</w:t>
+        <w:lastRenderedPageBreak/>
+        <w:t>[    ] Hunterian/lower thigh (0.34–0.47)</w:t>
       </w:r>
       <w:r>
         <w:rPr>
@@ -3799,6 +3972,7 @@
           <w:shd w:val="clear" w:color="auto" w:fill="F2F2F2"/>
         </w:rPr>
         <w:br/>
+        <w:t>[    ] Popliteal/SPJ (0.48–0.57)</w:t>
       </w:r>
       <w:r>
         <w:rPr>
@@ -3807,9 +3981,7 @@
           <w:sz w:val="18"/>
           <w:shd w:val="clear" w:color="auto" w:fill="F2F2F2"/>
         </w:rPr>
-        <w:lastRenderedPageBreak/>
         <w:br/>
-        <w:t>Q1-Q4 STATUS</w:t>
       </w:r>
       <w:r>
         <w:rPr>
@@ -3819,7 +3991,7 @@
           <w:shd w:val="clear" w:color="auto" w:fill="F2F2F2"/>
         </w:rPr>
         <w:br/>
-        <w:t>Q1 ANSWERED: EP N1→N2 at SFJ (right leg, posY 0.06).</w:t>
+        <w:t>Q1-Q4 STATUS</w:t>
       </w:r>
       <w:r>
         <w:rPr>
@@ -3829,7 +4001,7 @@
           <w:shd w:val="clear" w:color="auto" w:fill="F2F2F2"/>
         </w:rPr>
         <w:br/>
-        <w:t>Q2 ANSWERED: RP N2→N1 (mid-thigh, posY 0.31).</w:t>
+        <w:t>Q1 ANSWERED: EP N1→N2 at SFJ (right leg, posY 0.06).</w:t>
       </w:r>
       <w:r>
         <w:rPr>
@@ -3839,7 +4011,7 @@
           <w:shd w:val="clear" w:color="auto" w:fill="F2F2F2"/>
         </w:rPr>
         <w:br/>
-        <w:t>Q3 OPEN: No EP N2→N3 escape point yet.</w:t>
+        <w:t>Q2 ANSWERED: RP N2→N1 (mid-thigh, posY 0.31).</w:t>
       </w:r>
       <w:r>
         <w:rPr>
@@ -3849,7 +4021,7 @@
           <w:shd w:val="clear" w:color="auto" w:fill="F2F2F2"/>
         </w:rPr>
         <w:br/>
-        <w:t>Next step: Scan Hunterian zone (posY 0.34–0.47) for escape.</w:t>
+        <w:t>Q3 OPEN: No EP N2→N3 escape point yet.</w:t>
       </w:r>
       <w:r>
         <w:rPr>
@@ -3859,6 +4031,7 @@
           <w:shd w:val="clear" w:color="auto" w:fill="F2F2F2"/>
         </w:rPr>
         <w:br/>
+        <w:t>Next step: Scan Hunterian zone (posY 0.34–0.47) for escape.</w:t>
       </w:r>
       <w:r>
         <w:rPr>
@@ -3868,7 +4041,6 @@
           <w:shd w:val="clear" w:color="auto" w:fill="F2F2F2"/>
         </w:rPr>
         <w:br/>
-        <w:t>EXAMINATION PROTOCOL</w:t>
       </w:r>
       <w:r>
         <w:rPr>
@@ -3878,7 +4050,7 @@
           <w:shd w:val="clear" w:color="auto" w:fill="F2F2F2"/>
         </w:rPr>
         <w:br/>
-        <w:t>Hunterian perforators (posY 0.34–0.47, medial). Three maneuvers required:</w:t>
+        <w:t>EXAMINATION PROTOCOL</w:t>
       </w:r>
       <w:r>
         <w:rPr>
@@ -3888,6 +4060,16 @@
           <w:shd w:val="clear" w:color="auto" w:fill="F2F2F2"/>
         </w:rPr>
         <w:br/>
+        <w:t>Hunterian perforators (posY 0.34–0.47, medial). Three maneuvers required:</w:t>
+      </w:r>
+      <w:r>
+        <w:rPr>
+          <w:rFonts w:ascii="Courier New" w:hAnsi="Courier New"/>
+          <w:color w:val="1A1A2E"/>
+          <w:sz w:val="18"/>
+          <w:shd w:val="clear" w:color="auto" w:fill="F2F2F2"/>
+        </w:rPr>
+        <w:br/>
         <w:t>squeezing → Paranà → Valsalva. Pathological: ≥500 ms AND ≥3.5 mm.</w:t>
       </w:r>
     </w:p>
@@ -3966,7 +4148,7 @@
         <w:rPr>
           <w:color w:val="000000"/>
         </w:rPr>
-        <w:t>The agent maintains a 7-band coverage map — SFJ/groin, upper thigh, mid-thigh/Dodd, Hunterian, popliteal/SPJ, calf, and ankle. Each band is marked [DONE] once the probe has been in that zone. It then calls Groq LLM (temperature=0) to write a 2-sentence narrative summary of the full session so far. This gives the main crew agents contextual memory without repeating all raw coordinates.</w:t>
+        <w:t>This is now entirely pure Python — no LLM call is made. The agent computes the band-visit map and confirmed-clip list deterministically from session.scan_log and session.clips, then returns them as structured factual text. An LLM-generated narrative was removed because: (1) structured visited/unvisited lists are more reliably parsed by the Circuit Analyst than a prose summary; (2) zero latency vs 1–3 s for a Groq API call; (3) prose summaries occasionally hallucinate progress that was not actually made by the surgeon.</w:t>
       </w:r>
     </w:p>
     <w:p>
@@ -3977,7 +4159,7 @@
         <w:rPr>
           <w:color w:val="000000"/>
         </w:rPr>
-        <w:t>Why plain Python for the map, LLM only for the summary? The band marking is deterministic (a posY number either falls in a range or it does not). The summary requires natural language generation, so a brief LLM call is appropriate. This is the only sub-agent that calls an LLM.</w:t>
+        <w:t>Why pure Python for the entire history agent? The band marking is deterministic (a posY number either falls in a range or it does not). The narrative summary was converted from an LLM call to structured text output because the Circuit Analyst reasons more reliably from explicit lists than from ambiguous prose — and eliminating this LLM call saves 1–3 seconds per guidance turn.</w:t>
       </w:r>
     </w:p>
     <w:p>
@@ -4073,6 +4255,7 @@
           <w:color w:val="1F747D"/>
           <w:sz w:val="26"/>
         </w:rPr>
+        <w:lastRenderedPageBreak/>
         <w:t>6.3  Protocol Agent (protocol_agent.py)</w:t>
       </w:r>
     </w:p>
@@ -4095,7 +4278,6 @@
         <w:rPr>
           <w:color w:val="000000"/>
         </w:rPr>
-        <w:lastRenderedPageBreak/>
         <w:t>A pure lookup function — no LLM. Based on the current posY value, it returns the appropriate protocol text from a pre-built dictionary. All protocol content is sourced from published clinical literature with specific page references:</w:t>
       </w:r>
     </w:p>
@@ -4362,47 +4544,33 @@
       </w:r>
     </w:p>
     <w:p>
+      <w:r>
+        <w:t xml:space="preserve">NOTE — CURRENT VERSION: The system uses a three-tier frame source hierarchy instead of a single streaming video. Frames are selected in priority order: (1) guidance/ subfolder — reference frames with yellow fascia annotations and N1/N2/N3 labels (VLM is used); (2) </w:t>
+      </w:r>
+      <w:r>
+        <w:lastRenderedPageBreak/>
+        <w:t xml:space="preserve">vein_frames/ subfolder — pre-labelled anatomy frames with oval contours and vein-name labels (VLM is BYPASSED — folder metadata provides the vlm_dict directly, avoiding an API call); (3) streaming video — fallback, frame extracted by OpenCV at posY ratio (VLM is used). Frame selection is deterministic: bucket = </w:t>
+      </w:r>
+      <w:proofErr w:type="gramStart"/>
+      <w:r>
+        <w:t>round(</w:t>
+      </w:r>
+      <w:proofErr w:type="gramEnd"/>
+      <w:r>
+        <w:t>posY × 20); source index cycles through available sources as the probe moves, making results reproducible for the same probe position.</w:t>
+      </w:r>
+    </w:p>
+    <w:p>
       <w:pPr>
         <w:spacing w:before="240" w:after="60"/>
+      </w:pPr>
+      <w:proofErr w:type="gramStart"/>
+      <w:r>
         <w:rPr>
           <w:b/>
           <w:color w:val="1F747D"/>
           <w:sz w:val="26"/>
         </w:rPr>
-      </w:pPr>
-    </w:p>
-    <w:p>
-      <w:pPr>
-        <w:spacing w:before="240" w:after="60"/>
-        <w:rPr>
-          <w:b/>
-          <w:color w:val="1F747D"/>
-          <w:sz w:val="26"/>
-        </w:rPr>
-      </w:pPr>
-    </w:p>
-    <w:p>
-      <w:pPr>
-        <w:spacing w:before="240" w:after="60"/>
-        <w:rPr>
-          <w:b/>
-          <w:color w:val="1F747D"/>
-          <w:sz w:val="26"/>
-        </w:rPr>
-      </w:pPr>
-    </w:p>
-    <w:p>
-      <w:pPr>
-        <w:spacing w:before="240" w:after="60"/>
-      </w:pPr>
-      <w:proofErr w:type="gramStart"/>
-      <w:r>
-        <w:rPr>
-          <w:b/>
-          <w:color w:val="1F747D"/>
-          <w:sz w:val="26"/>
-        </w:rPr>
-        <w:lastRenderedPageBreak/>
         <w:t>7.3  VLM</w:t>
       </w:r>
       <w:proofErr w:type="gramEnd"/>
@@ -4544,6 +4712,11 @@
       </w:r>
     </w:p>
     <w:p>
+      <w:r>
+        <w:t>Two annotation styles are recognised by the VLM system prompt: Style A — guidance frames with yellow horizontal fascia lines and N1/N2/N3 text labels (the original annotated video style described in §7.2); Style B — vein_frames with oval contours and vein-name labels (GSV, SSV, Tributary, etc.). The VLM prompt adapts based on which style is detected, allowing accurate interpretation of both frame types.</w:t>
+      </w:r>
+    </w:p>
+    <w:p>
       <w:pPr>
         <w:pBdr>
           <w:bottom w:val="single" w:sz="6" w:space="1" w:color="1F3964"/>
@@ -4630,6 +4803,7 @@
           <w:sz w:val="18"/>
           <w:shd w:val="clear" w:color="auto" w:fill="F2F2F2"/>
         </w:rPr>
+        <w:lastRenderedPageBreak/>
         <w:t>Task 1 (Clinical Interpreter) → output: clinical picture (100 words)</w:t>
       </w:r>
       <w:r>
@@ -4650,7 +4824,7 @@
           <w:shd w:val="clear" w:color="auto" w:fill="F2F2F2"/>
         </w:rPr>
         <w:br/>
-        <w:t xml:space="preserve">                   └─ context ──→ Task 3 (Circuit Analyst) → output: open Q + target zone (60 words)</w:t>
+        <w:t xml:space="preserve">                   └─ context ──→ Task 3 (Circuit Analyst) → output: examination state A–F + target zone (80 words)</w:t>
       </w:r>
       <w:r>
         <w:rPr>
@@ -4660,7 +4834,7 @@
           <w:shd w:val="clear" w:color="auto" w:fill="F2F2F2"/>
         </w:rPr>
         <w:br/>
-        <w:t xml:space="preserve">                                   └─ context ──→ Task 4 (Navigation Planner) → output: scan plan (50 words)</w:t>
+        <w:t xml:space="preserve">                                   └─ context ──→ Task 4 (Navigation Planner) → output: one movement command ≤15 words (direction + anatomy + zone)</w:t>
       </w:r>
       <w:r>
         <w:rPr>
@@ -4680,25 +4854,7 @@
           <w:shd w:val="clear" w:color="auto" w:fill="F2F2F2"/>
         </w:rPr>
         <w:br/>
-        <w:t xml:space="preserve">                                                                   → output: final ≤12-word</w:t>
-      </w:r>
-      <w:r>
-        <w:rPr>
-          <w:rFonts w:ascii="Courier New" w:hAnsi="Courier New"/>
-          <w:color w:val="1A1A2E"/>
-          <w:sz w:val="18"/>
-          <w:shd w:val="clear" w:color="auto" w:fill="F2F2F2"/>
-        </w:rPr>
-        <w:t xml:space="preserve"> guidance in</w:t>
-      </w:r>
-      <w:r>
-        <w:rPr>
-          <w:rFonts w:ascii="Courier New" w:hAnsi="Courier New"/>
-          <w:color w:val="1A1A2E"/>
-          <w:sz w:val="18"/>
-          <w:shd w:val="clear" w:color="auto" w:fill="F2F2F2"/>
-        </w:rPr>
-        <w:t xml:space="preserve"> JSON</w:t>
+        <w:t xml:space="preserve">                                                                   → output: final ≤12-word guidance in JSON</w:t>
       </w:r>
     </w:p>
     <w:p>
@@ -4709,7 +4865,6 @@
         <w:rPr>
           <w:color w:val="000000"/>
         </w:rPr>
-        <w:lastRenderedPageBreak/>
         <w:t>Agent 5 does not re-read the raw state message — it reads three layers of processed, increasingly specific output from the agents before it. Each agent narrows the problem space for the next.</w:t>
       </w:r>
     </w:p>
@@ -4736,6 +4891,11 @@
           <w:color w:val="444444"/>
         </w:rPr>
         <w:t>Agent 1 — Clinical Interpreter  (ported from Task 1)</w:t>
+      </w:r>
+    </w:p>
+    <w:p>
+      <w:r>
+        <w:t>[Model tier: Mid (llama-3.3-70b-versatile). Synthesis task — reads clips, VLM, history; no strict rule matching needed.]</w:t>
       </w:r>
     </w:p>
     <w:tbl>
@@ -5010,6 +5170,11 @@
         <w:t>Agent 2 — Shunt Analyst  (ported from Task 1)</w:t>
       </w:r>
     </w:p>
+    <w:p>
+      <w:r>
+        <w:t>[Model tier: Heavy (gpt-oss-120b). Strict rule reasoning — correct identification of the full minimum clip set for each CHIVA type demands the most capable model in the pipeline.]</w:t>
+      </w:r>
+    </w:p>
     <w:tbl>
       <w:tblPr>
         <w:tblStyle w:val="TableGrid"/>
@@ -5209,57 +5374,34 @@
     <w:p>
       <w:pPr>
         <w:spacing w:before="160" w:after="40"/>
+      </w:pPr>
+      <w:r>
         <w:rPr>
           <w:b/>
           <w:color w:val="444444"/>
         </w:rPr>
-      </w:pPr>
-    </w:p>
-    <w:p>
-      <w:pPr>
-        <w:spacing w:before="160" w:after="40"/>
+        <w:t xml:space="preserve">Agent 3 — Circuit </w:t>
+      </w:r>
+      <w:proofErr w:type="gramStart"/>
+      <w:r>
         <w:rPr>
           <w:b/>
           <w:color w:val="444444"/>
         </w:rPr>
-      </w:pPr>
-    </w:p>
-    <w:p>
-      <w:pPr>
-        <w:spacing w:before="160" w:after="40"/>
+        <w:t>Analyst  (</w:t>
+      </w:r>
+      <w:proofErr w:type="gramEnd"/>
+      <w:r>
         <w:rPr>
           <w:b/>
           <w:color w:val="444444"/>
         </w:rPr>
-      </w:pPr>
-    </w:p>
-    <w:p>
-      <w:pPr>
-        <w:spacing w:before="160" w:after="40"/>
-      </w:pPr>
-      <w:r>
-        <w:rPr>
-          <w:b/>
-          <w:color w:val="444444"/>
-        </w:rPr>
-        <w:lastRenderedPageBreak/>
-        <w:t xml:space="preserve">Agent 3 — Circuit </w:t>
-      </w:r>
-      <w:proofErr w:type="gramStart"/>
-      <w:r>
-        <w:rPr>
-          <w:b/>
-          <w:color w:val="444444"/>
-        </w:rPr>
-        <w:t>Analyst  (</w:t>
-      </w:r>
-      <w:proofErr w:type="gramEnd"/>
-      <w:r>
-        <w:rPr>
-          <w:b/>
-          <w:color w:val="444444"/>
-        </w:rPr>
         <w:t>new in Task 2)</w:t>
+      </w:r>
+    </w:p>
+    <w:p>
+      <w:r>
+        <w:t>[Model tier: Heavy (gpt-oss-120b). NEW IN CURRENT VERSION: This agent now determines a formal Examination State (A–F) from the Q-state and scan history, then issues specific routing or examination instructions for each state. See Section 8.7 for the full A–F state reference table.]</w:t>
       </w:r>
     </w:p>
     <w:tbl>
@@ -5423,7 +5565,14 @@
         </w:tc>
       </w:tr>
     </w:tbl>
-    <w:p/>
+    <w:p>
+      <w:pPr>
+        <w:spacing w:before="40" w:after="80"/>
+        <w:rPr>
+          <w:color w:val="000000"/>
+        </w:rPr>
+      </w:pPr>
+    </w:p>
     <w:p>
       <w:pPr>
         <w:spacing w:before="40" w:after="80"/>
@@ -5456,6 +5605,11 @@
           <w:color w:val="444444"/>
         </w:rPr>
         <w:t>Agent 4 — Navigation Planner  (new in Task 2)</w:t>
+      </w:r>
+    </w:p>
+    <w:p>
+      <w:r>
+        <w:t>[Model tier: Mid (llama-3.3-70b-versatile). NEW IN CURRENT VERSION: output capped at ≤15 words (previously ~50 words). A strict forbidden-terms list prevents Q1/Q2/Q3/Q4/EP/RP/N1/N2/N3/shunt from appearing in the surgeon-facing output — only anatomical navigation terms are permitted. See Section 8.10.]</w:t>
       </w:r>
     </w:p>
     <w:tbl>
@@ -5639,6 +5793,7 @@
         <w:rPr>
           <w:color w:val="000000"/>
         </w:rPr>
+        <w:lastRenderedPageBreak/>
         <w:t>Example output: "Target posY 0.34–0.47, medial surface. Scan distally from current position. Target: N3 perforator exiting fascia above GSV. Three maneuvers: squeezing → Paranà → Valsalva. (Delfrate 2023)."</w:t>
       </w:r>
     </w:p>
@@ -5652,6 +5807,11 @@
           <w:color w:val="444444"/>
         </w:rPr>
         <w:t>Agent 5 — Guidance Specialist  (new in Task 2)</w:t>
+      </w:r>
+    </w:p>
+    <w:p>
+      <w:r>
+        <w:t>[Model tier: Heavy (gpt-oss-120b). Chosen heavy because it must simultaneously parse the Shunt Analyst's JSON flags (elim_required, confirmed) and copy the Navigation Planner's text verbatim — two precise operations that benefit from the largest model.]</w:t>
       </w:r>
     </w:p>
     <w:tbl>
@@ -5829,14 +5989,6 @@
         </w:rPr>
         <w:t>This is the final output agent. It synthesises everything upstream and produces the instruction that appears on screen for the surgeon. The three action types are:</w:t>
       </w:r>
-    </w:p>
-    <w:p>
-      <w:pPr>
-        <w:spacing w:before="40" w:after="80"/>
-        <w:rPr>
-          <w:color w:val="000000"/>
-        </w:rPr>
-      </w:pPr>
     </w:p>
     <w:p>
       <w:pPr>
@@ -5867,7 +6019,6 @@
                 <w:color w:val="FFFFFF"/>
                 <w:sz w:val="20"/>
               </w:rPr>
-              <w:lastRenderedPageBreak/>
               <w:t>Action</w:t>
             </w:r>
           </w:p>
@@ -6032,18 +6183,27 @@
         </w:tc>
       </w:tr>
     </w:tbl>
-    <w:p/>
     <w:p>
       <w:pPr>
         <w:spacing w:before="240" w:after="60"/>
       </w:pPr>
+      <w:proofErr w:type="gramStart"/>
       <w:r>
         <w:rPr>
           <w:b/>
           <w:color w:val="1F747D"/>
           <w:sz w:val="26"/>
         </w:rPr>
-        <w:t>8.4  Shunt Detection — By-Product of the Pipeline</w:t>
+        <w:t>8.4  Shunt</w:t>
+      </w:r>
+      <w:proofErr w:type="gramEnd"/>
+      <w:r>
+        <w:rPr>
+          <w:b/>
+          <w:color w:val="1F747D"/>
+          <w:sz w:val="26"/>
+        </w:rPr>
+        <w:t xml:space="preserve"> Detection — By-Product of the Pipeline</w:t>
       </w:r>
     </w:p>
     <w:p>
@@ -6111,6 +6271,15 @@
           <w:color w:val="000000"/>
         </w:rPr>
         <w:t>. This acts as a Feeback-Based Reinforcement Learning Framework helping the System make better quality classifications.</w:t>
+      </w:r>
+    </w:p>
+    <w:p>
+      <w:r>
+        <w:t xml:space="preserve">Multi-Shunt Scanning: Once a shunt type is accepted by the surgeon, it is added to the session's accepted_shunts set. On all subsequent crew runs, the Shunt Analyst receives an accepted_ctx block listing accepted types, instructing it NOT to re-confirm them. The Guidance Specialist sets </w:t>
+      </w:r>
+      <w:r>
+        <w:lastRenderedPageBreak/>
+        <w:t>action='complete' only for a NEWLY confirmed type not yet in accepted_shunts. This allows the surgeon to continue scanning the same leg for additional shunt circuits after the first is accepted — a common clinical scenario where a patient has more than one haemodynamic circuit.</w:t>
       </w:r>
     </w:p>
     <w:p>
@@ -6238,7 +6407,21 @@
         <w:rPr>
           <w:color w:val="000000"/>
         </w:rPr>
-        <w:t>This adds zero latency, requires no configuration, and is entirely invisible to the rest of the application. It was a necessary fix to make the full CrewAI pipeline run stably on Groq infrastructure.</w:t>
+        <w:t xml:space="preserve">This adds zero latency, requires no configuration, and is entirely invisible to the rest of the application. It was a necessary fix to make the full CrewAI pipeline run stably on </w:t>
+      </w:r>
+      <w:proofErr w:type="spellStart"/>
+      <w:r>
+        <w:rPr>
+          <w:color w:val="000000"/>
+        </w:rPr>
+        <w:t>Groq</w:t>
+      </w:r>
+      <w:proofErr w:type="spellEnd"/>
+      <w:r>
+        <w:rPr>
+          <w:color w:val="000000"/>
+        </w:rPr>
+        <w:t xml:space="preserve"> infrastructure.</w:t>
       </w:r>
     </w:p>
     <w:p>
@@ -6247,40 +6430,13 @@
           <w:bottom w:val="single" w:sz="6" w:space="1" w:color="1F3964"/>
         </w:pBdr>
         <w:spacing w:before="360" w:after="120"/>
+      </w:pPr>
+      <w:r>
         <w:rPr>
           <w:b/>
           <w:color w:val="1F3964"/>
           <w:sz w:val="32"/>
         </w:rPr>
-      </w:pPr>
-    </w:p>
-    <w:p>
-      <w:pPr>
-        <w:pBdr>
-          <w:bottom w:val="single" w:sz="6" w:space="1" w:color="1F3964"/>
-        </w:pBdr>
-        <w:spacing w:before="360" w:after="120"/>
-        <w:rPr>
-          <w:b/>
-          <w:color w:val="1F3964"/>
-          <w:sz w:val="32"/>
-        </w:rPr>
-      </w:pPr>
-    </w:p>
-    <w:p>
-      <w:pPr>
-        <w:pBdr>
-          <w:bottom w:val="single" w:sz="6" w:space="1" w:color="1F3964"/>
-        </w:pBdr>
-        <w:spacing w:before="360" w:after="120"/>
-      </w:pPr>
-      <w:r>
-        <w:rPr>
-          <w:b/>
-          <w:color w:val="1F3964"/>
-          <w:sz w:val="32"/>
-        </w:rPr>
-        <w:lastRenderedPageBreak/>
         <w:t>9. Position Alerts — Hard-Coded Safety Rules</w:t>
       </w:r>
       <w:r>
@@ -6406,6 +6562,12 @@
               </w:rPr>
               <w:t>posY 0.04–0.07 AND no clips yet</w:t>
             </w:r>
+            <w:r>
+              <w:rPr>
+                <w:sz w:val="20"/>
+              </w:rPr>
+              <w:t xml:space="preserve"> (i.e. at the start)</w:t>
+            </w:r>
           </w:p>
         </w:tc>
         <w:tc>
@@ -6474,7 +6636,7 @@
               <w:rPr>
                 <w:sz w:val="20"/>
               </w:rPr>
-              <w:t>"Trunk reflux confirmed; no escape found. Scan for N3 above fascia at this level — do NOT output complete."</w:t>
+              <w:t>"Trunk reflux confirmed; no escape found. Scan for N3 at this level — do NOT output complete."</w:t>
             </w:r>
           </w:p>
         </w:tc>
@@ -6562,6 +6724,7 @@
           <w:color w:val="1F3964"/>
           <w:sz w:val="32"/>
         </w:rPr>
+        <w:lastRenderedPageBreak/>
         <w:t>10. Frontend — The Streaming UI</w:t>
       </w:r>
     </w:p>
@@ -6737,25 +6900,14 @@
     <w:p>
       <w:pPr>
         <w:spacing w:before="240" w:after="60"/>
+      </w:pPr>
+      <w:proofErr w:type="gramStart"/>
+      <w:r>
         <w:rPr>
           <w:b/>
           <w:color w:val="1F747D"/>
           <w:sz w:val="26"/>
         </w:rPr>
-      </w:pPr>
-    </w:p>
-    <w:p>
-      <w:pPr>
-        <w:spacing w:before="240" w:after="60"/>
-      </w:pPr>
-      <w:proofErr w:type="gramStart"/>
-      <w:r>
-        <w:rPr>
-          <w:b/>
-          <w:color w:val="1F747D"/>
-          <w:sz w:val="26"/>
-        </w:rPr>
-        <w:lastRenderedPageBreak/>
         <w:t>10.3  Real</w:t>
       </w:r>
       <w:proofErr w:type="gramEnd"/>
@@ -7206,6 +7358,7 @@
         <w:rPr>
           <w:color w:val="000000"/>
         </w:rPr>
+        <w:lastRenderedPageBreak/>
         <w:t>Task 2 inherits Agents 1 and 2 (Clinical Interpreter and Shunt Analyst) from Task 1. Agents 3, 4, and 5 (Circuit Analyst, Navigation Planner, Guidance Specialist) are new additions specific to the real-time navigation problem.</w:t>
       </w:r>
     </w:p>
@@ -7276,35 +7429,32 @@
     <w:p>
       <w:pPr>
         <w:spacing w:before="240" w:after="60"/>
+      </w:pPr>
+      <w:proofErr w:type="gramStart"/>
+      <w:r>
         <w:rPr>
           <w:b/>
           <w:color w:val="1F747D"/>
           <w:sz w:val="26"/>
         </w:rPr>
-      </w:pPr>
-    </w:p>
-    <w:p>
-      <w:pPr>
-        <w:spacing w:before="240" w:after="60"/>
-      </w:pPr>
-      <w:proofErr w:type="gramStart"/>
+        <w:t>12.3  Why</w:t>
+      </w:r>
+      <w:proofErr w:type="gramEnd"/>
       <w:r>
         <w:rPr>
           <w:b/>
           <w:color w:val="1F747D"/>
           <w:sz w:val="26"/>
         </w:rPr>
-        <w:lastRenderedPageBreak/>
-        <w:t>12.3  Why</w:t>
-      </w:r>
-      <w:proofErr w:type="gramEnd"/>
+        <w:t xml:space="preserve"> </w:t>
+      </w:r>
       <w:r>
         <w:rPr>
           <w:b/>
           <w:color w:val="1F747D"/>
           <w:sz w:val="26"/>
         </w:rPr>
-        <w:t xml:space="preserve"> </w:t>
+        <w:t xml:space="preserve">some </w:t>
       </w:r>
       <w:r>
         <w:rPr>
@@ -7312,33 +7462,88 @@
           <w:color w:val="1F747D"/>
           <w:sz w:val="26"/>
         </w:rPr>
-        <w:t xml:space="preserve">some </w:t>
-      </w:r>
+        <w:t xml:space="preserve">Sub-Agents </w:t>
+      </w:r>
+      <w:proofErr w:type="gramStart"/>
       <w:r>
         <w:rPr>
           <w:b/>
           <w:color w:val="1F747D"/>
           <w:sz w:val="26"/>
         </w:rPr>
-        <w:t xml:space="preserve">Sub-Agents </w:t>
-      </w:r>
-      <w:proofErr w:type="gramStart"/>
+        <w:t>as</w:t>
+      </w:r>
+      <w:proofErr w:type="gramEnd"/>
       <w:r>
         <w:rPr>
           <w:b/>
           <w:color w:val="1F747D"/>
           <w:sz w:val="26"/>
         </w:rPr>
-        <w:t>as</w:t>
-      </w:r>
-      <w:proofErr w:type="gramEnd"/>
+        <w:t xml:space="preserve"> Plain Python Instead of LLM?</w:t>
+      </w:r>
+    </w:p>
+    <w:p>
+      <w:pPr>
+        <w:spacing w:before="40" w:after="80"/>
+      </w:pPr>
+      <w:r>
+        <w:rPr>
+          <w:color w:val="000000"/>
+        </w:rPr>
+        <w:t>The history coverage map, Q-state derivation, and protocol lookup were initially designed as LLM calls but converted to deterministic Python for three reasons:</w:t>
+      </w:r>
+    </w:p>
+    <w:p>
+      <w:pPr>
+        <w:pStyle w:val="ListBullet"/>
+        <w:spacing w:before="20" w:after="40"/>
+        <w:ind w:left="283"/>
+      </w:pPr>
+      <w:r>
+        <w:rPr>
+          <w:color w:val="000000"/>
+        </w:rPr>
+        <w:t>Speed: Plain Python runs in milliseconds; an LLM call adds 1–3 seconds. With 5 agents already in the crew, avoiding 3 additional LLM calls keeps the pipeline usable in real time.</w:t>
+      </w:r>
+    </w:p>
+    <w:p>
+      <w:pPr>
+        <w:pStyle w:val="ListBullet"/>
+        <w:spacing w:before="20" w:after="40"/>
+        <w:ind w:left="283"/>
+      </w:pPr>
+      <w:r>
+        <w:rPr>
+          <w:color w:val="000000"/>
+        </w:rPr>
+        <w:t>Reliability: The Q-state logic (which Q is open) must be correct 100% of the time. Pure rule-based logic cannot hallucinate.</w:t>
+      </w:r>
+    </w:p>
+    <w:p>
+      <w:pPr>
+        <w:pStyle w:val="ListBullet"/>
+        <w:spacing w:before="20" w:after="40"/>
+        <w:ind w:left="283"/>
+      </w:pPr>
+      <w:r>
+        <w:rPr>
+          <w:color w:val="000000"/>
+        </w:rPr>
+        <w:t>Cost: Three fewer Groq API calls per guidance turn significantly reduces API usage over a full examination session.</w:t>
+      </w:r>
+    </w:p>
+    <w:p>
+      <w:pPr>
+        <w:spacing w:before="240" w:after="60"/>
+      </w:pPr>
       <w:r>
         <w:rPr>
           <w:b/>
           <w:color w:val="1F747D"/>
           <w:sz w:val="26"/>
         </w:rPr>
-        <w:t xml:space="preserve"> Plain Python Instead of LLM?</w:t>
+        <w:t>12.4  Why Not Use Conversation History (as in the Earlier Version)?</w:t>
       </w:r>
     </w:p>
     <w:p>
@@ -7349,7 +7554,7 @@
         <w:rPr>
           <w:color w:val="000000"/>
         </w:rPr>
-        <w:t>The history coverage map, Q-state derivation, and protocol lookup were initially designed as LLM calls but converted to deterministic Python for three reasons:</w:t>
+        <w:t>An earlier streaming engine version used a rolling conversation window (last 8 LLM turns), similar to a chatbot. This was replaced with the CrewAI approach because:</w:t>
       </w:r>
     </w:p>
     <w:p>
@@ -7362,7 +7567,7 @@
         <w:rPr>
           <w:color w:val="000000"/>
         </w:rPr>
-        <w:t>Speed: Plain Python runs in milliseconds; an LLM call adds 1–3 seconds. With 5 agents already in the crew, avoiding 3 additional LLM calls keeps the pipeline usable in real time.</w:t>
+        <w:t>Rolling history accumulates outdated context. What the LLM said 8 clicks ago may no longer be clinically relevant at the current probe position.</w:t>
       </w:r>
     </w:p>
     <w:p>
@@ -7375,7 +7580,7 @@
         <w:rPr>
           <w:color w:val="000000"/>
         </w:rPr>
-        <w:t>Reliability: The Q-state logic (which Q is open) must be correct 100% of the time. Pure rule-based logic cannot hallucinate.</w:t>
+        <w:t>Each new state message now contains explicit, structured summaries (scan coverage from history_agent, Q-state from q_state_agent) rather than requiring the LLM to infer session context from conversation history.</w:t>
       </w:r>
     </w:p>
     <w:p>
@@ -7388,7 +7593,7 @@
         <w:rPr>
           <w:color w:val="000000"/>
         </w:rPr>
-        <w:t>Cost: Three fewer Groq API calls per guidance turn significantly reduces API usage over a full examination session.</w:t>
+        <w:t>Specialised agents with focused roles produce more reliable reasoning than a single LLM simultaneously tracking all dimensions of the examination.</w:t>
       </w:r>
     </w:p>
     <w:p>
@@ -7401,69 +7606,7 @@
           <w:color w:val="1F747D"/>
           <w:sz w:val="26"/>
         </w:rPr>
-        <w:t>12.4  Why Not Use Conversation History (as in the Earlier Version)?</w:t>
-      </w:r>
-    </w:p>
-    <w:p>
-      <w:pPr>
-        <w:spacing w:before="40" w:after="80"/>
-      </w:pPr>
-      <w:r>
-        <w:rPr>
-          <w:color w:val="000000"/>
-        </w:rPr>
-        <w:t>An earlier streaming engine version used a rolling conversation window (last 8 LLM turns), similar to a chatbot. This was replaced with the CrewAI approach because:</w:t>
-      </w:r>
-    </w:p>
-    <w:p>
-      <w:pPr>
-        <w:pStyle w:val="ListBullet"/>
-        <w:spacing w:before="20" w:after="40"/>
-        <w:ind w:left="283"/>
-      </w:pPr>
-      <w:r>
-        <w:rPr>
-          <w:color w:val="000000"/>
-        </w:rPr>
-        <w:t>Rolling history accumulates outdated context. What the LLM said 8 clicks ago may no longer be clinically relevant at the current probe position.</w:t>
-      </w:r>
-    </w:p>
-    <w:p>
-      <w:pPr>
-        <w:pStyle w:val="ListBullet"/>
-        <w:spacing w:before="20" w:after="40"/>
-        <w:ind w:left="283"/>
-      </w:pPr>
-      <w:r>
-        <w:rPr>
-          <w:color w:val="000000"/>
-        </w:rPr>
-        <w:t>Each new state message now contains explicit, structured summaries (scan coverage from history_agent, Q-state from q_state_agent) rather than requiring the LLM to infer session context from conversation history.</w:t>
-      </w:r>
-    </w:p>
-    <w:p>
-      <w:pPr>
-        <w:pStyle w:val="ListBullet"/>
-        <w:spacing w:before="20" w:after="40"/>
-        <w:ind w:left="283"/>
-      </w:pPr>
-      <w:r>
-        <w:rPr>
-          <w:color w:val="000000"/>
-        </w:rPr>
-        <w:t>Specialised agents with focused roles produce more reliable reasoning than a single LLM simultaneously tracking all dimensions of the examination.</w:t>
-      </w:r>
-    </w:p>
-    <w:p>
-      <w:pPr>
-        <w:spacing w:before="240" w:after="60"/>
-      </w:pPr>
-      <w:r>
-        <w:rPr>
-          <w:b/>
-          <w:color w:val="1F747D"/>
-          <w:sz w:val="26"/>
-        </w:rPr>
+        <w:lastRenderedPageBreak/>
         <w:t>12.5  Why opencv-python-headless Instead of opencv-python?</w:t>
       </w:r>
     </w:p>
@@ -7697,7 +7840,6 @@
               <w:rPr>
                 <w:sz w:val="20"/>
               </w:rPr>
-              <w:lastRenderedPageBreak/>
               <w:t>Delfrate R. 2023</w:t>
             </w:r>
           </w:p>
@@ -7894,22 +8036,29 @@
         <w:tblLook w:val="04A0" w:firstRow="1" w:lastRow="0" w:firstColumn="1" w:lastColumn="0" w:noHBand="0" w:noVBand="1"/>
       </w:tblPr>
       <w:tblGrid>
-        <w:gridCol w:w="1273"/>
-        <w:gridCol w:w="5034"/>
-        <w:gridCol w:w="3031"/>
+        <w:gridCol w:w="1243"/>
+        <w:gridCol w:w="5053"/>
+        <w:gridCol w:w="3042"/>
       </w:tblGrid>
       <w:tr>
         <w:tc>
           <w:tcPr>
-            <w:tcW w:w="1384" w:type="dxa"/>
+            <w:tcW w:w="3794" w:type="dxa"/>
             <w:shd w:val="clear" w:color="auto" w:fill="1F3964"/>
           </w:tcPr>
           <w:p>
+            <w:pPr>
+              <w:rPr>
+                <w:sz w:val="19"/>
+                <w:szCs w:val="19"/>
+              </w:rPr>
+            </w:pPr>
             <w:r>
               <w:rPr>
                 <w:b/>
                 <w:color w:val="FFFFFF"/>
-                <w:sz w:val="20"/>
+                <w:sz w:val="19"/>
+                <w:szCs w:val="19"/>
               </w:rPr>
               <w:t>Component</w:t>
             </w:r>
@@ -7917,15 +8066,22 @@
         </w:tc>
         <w:tc>
           <w:tcPr>
-            <w:tcW w:w="4923" w:type="dxa"/>
+            <w:tcW w:w="2513" w:type="dxa"/>
             <w:shd w:val="clear" w:color="auto" w:fill="1F3964"/>
           </w:tcPr>
           <w:p>
+            <w:pPr>
+              <w:rPr>
+                <w:sz w:val="19"/>
+                <w:szCs w:val="19"/>
+              </w:rPr>
+            </w:pPr>
             <w:r>
               <w:rPr>
                 <w:b/>
                 <w:color w:val="FFFFFF"/>
-                <w:sz w:val="20"/>
+                <w:sz w:val="19"/>
+                <w:szCs w:val="19"/>
               </w:rPr>
               <w:t>Task 1</w:t>
             </w:r>
@@ -7937,11 +8093,18 @@
             <w:shd w:val="clear" w:color="auto" w:fill="1F3964"/>
           </w:tcPr>
           <w:p>
+            <w:pPr>
+              <w:rPr>
+                <w:sz w:val="19"/>
+                <w:szCs w:val="19"/>
+              </w:rPr>
+            </w:pPr>
             <w:r>
               <w:rPr>
                 <w:b/>
                 <w:color w:val="FFFFFF"/>
-                <w:sz w:val="20"/>
+                <w:sz w:val="19"/>
+                <w:szCs w:val="19"/>
               </w:rPr>
               <w:t>Task 2</w:t>
             </w:r>
@@ -7951,7 +8114,7 @@
       <w:tr>
         <w:tc>
           <w:tcPr>
-            <w:tcW w:w="1384" w:type="dxa"/>
+            <w:tcW w:w="3794" w:type="dxa"/>
           </w:tcPr>
           <w:p>
             <w:r>
@@ -7964,7 +8127,7 @@
         </w:tc>
         <w:tc>
           <w:tcPr>
-            <w:tcW w:w="4923" w:type="dxa"/>
+            <w:tcW w:w="2513" w:type="dxa"/>
           </w:tcPr>
           <w:p>
             <w:r>
@@ -7992,21 +8155,29 @@
       <w:tr>
         <w:tc>
           <w:tcPr>
-            <w:tcW w:w="1384" w:type="dxa"/>
+            <w:tcW w:w="3794" w:type="dxa"/>
             <w:shd w:val="clear" w:color="auto" w:fill="EBF3F8"/>
           </w:tcPr>
           <w:p>
-            <w:r>
-              <w:rPr>
-                <w:sz w:val="20"/>
-              </w:rPr>
-              <w:t>Systemd service</w:t>
-            </w:r>
-          </w:p>
-        </w:tc>
-        <w:tc>
-          <w:tcPr>
-            <w:tcW w:w="4923" w:type="dxa"/>
+            <w:proofErr w:type="spellStart"/>
+            <w:r>
+              <w:rPr>
+                <w:sz w:val="20"/>
+              </w:rPr>
+              <w:t>Systemd</w:t>
+            </w:r>
+            <w:proofErr w:type="spellEnd"/>
+            <w:r>
+              <w:rPr>
+                <w:sz w:val="20"/>
+              </w:rPr>
+              <w:t xml:space="preserve"> service</w:t>
+            </w:r>
+          </w:p>
+        </w:tc>
+        <w:tc>
+          <w:tcPr>
+            <w:tcW w:w="2513" w:type="dxa"/>
             <w:shd w:val="clear" w:color="auto" w:fill="EBF3F8"/>
           </w:tcPr>
           <w:p>
@@ -8036,20 +8207,28 @@
       <w:tr>
         <w:tc>
           <w:tcPr>
-            <w:tcW w:w="1384" w:type="dxa"/>
-          </w:tcPr>
-          <w:p>
-            <w:r>
-              <w:rPr>
-                <w:sz w:val="20"/>
-              </w:rPr>
-              <w:t>Gunicorn worker</w:t>
-            </w:r>
-          </w:p>
-        </w:tc>
-        <w:tc>
-          <w:tcPr>
-            <w:tcW w:w="4923" w:type="dxa"/>
+            <w:tcW w:w="3794" w:type="dxa"/>
+          </w:tcPr>
+          <w:p>
+            <w:proofErr w:type="spellStart"/>
+            <w:r>
+              <w:rPr>
+                <w:sz w:val="20"/>
+              </w:rPr>
+              <w:t>Gunicorn</w:t>
+            </w:r>
+            <w:proofErr w:type="spellEnd"/>
+            <w:r>
+              <w:rPr>
+                <w:sz w:val="20"/>
+              </w:rPr>
+              <w:t xml:space="preserve"> worker</w:t>
+            </w:r>
+          </w:p>
+        </w:tc>
+        <w:tc>
+          <w:tcPr>
+            <w:tcW w:w="2513" w:type="dxa"/>
           </w:tcPr>
           <w:p>
             <w:r>
@@ -8065,11 +8244,19 @@
             <w:tcW w:w="3031" w:type="dxa"/>
           </w:tcPr>
           <w:p>
-            <w:r>
-              <w:rPr>
-                <w:sz w:val="20"/>
-              </w:rPr>
-              <w:t>gthread (1 worker, 4 threads)</w:t>
+            <w:proofErr w:type="spellStart"/>
+            <w:r>
+              <w:rPr>
+                <w:sz w:val="20"/>
+              </w:rPr>
+              <w:t>gthread</w:t>
+            </w:r>
+            <w:proofErr w:type="spellEnd"/>
+            <w:r>
+              <w:rPr>
+                <w:sz w:val="20"/>
+              </w:rPr>
+              <w:t xml:space="preserve"> (1 worker, 4 threads)</w:t>
             </w:r>
           </w:p>
         </w:tc>
@@ -8077,7 +8264,7 @@
       <w:tr>
         <w:tc>
           <w:tcPr>
-            <w:tcW w:w="1384" w:type="dxa"/>
+            <w:tcW w:w="3794" w:type="dxa"/>
             <w:shd w:val="clear" w:color="auto" w:fill="EBF3F8"/>
           </w:tcPr>
           <w:p>
@@ -8091,7 +8278,7 @@
         </w:tc>
         <w:tc>
           <w:tcPr>
-            <w:tcW w:w="4923" w:type="dxa"/>
+            <w:tcW w:w="2513" w:type="dxa"/>
             <w:shd w:val="clear" w:color="auto" w:fill="EBF3F8"/>
           </w:tcPr>
           <w:p>
@@ -8099,8 +8286,30 @@
               <w:rPr>
                 <w:sz w:val="20"/>
               </w:rPr>
-              <w:t>/var/www/shunt_classification_and_ligation/shunt.sock</w:t>
-            </w:r>
+              <w:t>/var/www/</w:t>
+            </w:r>
+            <w:proofErr w:type="spellStart"/>
+            <w:r>
+              <w:rPr>
+                <w:sz w:val="20"/>
+              </w:rPr>
+              <w:t>shunt_classification_and_ligation</w:t>
+            </w:r>
+            <w:proofErr w:type="spellEnd"/>
+            <w:r>
+              <w:rPr>
+                <w:sz w:val="20"/>
+              </w:rPr>
+              <w:t>/</w:t>
+            </w:r>
+            <w:proofErr w:type="spellStart"/>
+            <w:r>
+              <w:rPr>
+                <w:sz w:val="20"/>
+              </w:rPr>
+              <w:t>shunt.sock</w:t>
+            </w:r>
+            <w:proofErr w:type="spellEnd"/>
           </w:p>
         </w:tc>
         <w:tc>
@@ -8121,27 +8330,42 @@
       <w:tr>
         <w:tc>
           <w:tcPr>
-            <w:tcW w:w="1384" w:type="dxa"/>
-          </w:tcPr>
-          <w:p>
-            <w:r>
-              <w:rPr>
-                <w:sz w:val="20"/>
-              </w:rPr>
+            <w:tcW w:w="3794" w:type="dxa"/>
+          </w:tcPr>
+          <w:p>
+            <w:r>
+              <w:rPr>
+                <w:sz w:val="20"/>
+              </w:rPr>
+              <w:lastRenderedPageBreak/>
               <w:t>Log directory</w:t>
             </w:r>
           </w:p>
         </w:tc>
         <w:tc>
           <w:tcPr>
-            <w:tcW w:w="4923" w:type="dxa"/>
-          </w:tcPr>
-          <w:p>
-            <w:r>
-              <w:rPr>
-                <w:sz w:val="20"/>
-              </w:rPr>
-              <w:t>/var/log/shunt_classification_and_ligation/</w:t>
+            <w:tcW w:w="2513" w:type="dxa"/>
+          </w:tcPr>
+          <w:p>
+            <w:r>
+              <w:rPr>
+                <w:sz w:val="20"/>
+              </w:rPr>
+              <w:t>/var/log/</w:t>
+            </w:r>
+            <w:proofErr w:type="spellStart"/>
+            <w:r>
+              <w:rPr>
+                <w:sz w:val="20"/>
+              </w:rPr>
+              <w:t>shunt_classification_and_ligation</w:t>
+            </w:r>
+            <w:proofErr w:type="spellEnd"/>
+            <w:r>
+              <w:rPr>
+                <w:sz w:val="20"/>
+              </w:rPr>
+              <w:t>/</w:t>
             </w:r>
           </w:p>
         </w:tc>
@@ -8162,7 +8386,7 @@
       <w:tr>
         <w:tc>
           <w:tcPr>
-            <w:tcW w:w="1384" w:type="dxa"/>
+            <w:tcW w:w="3794" w:type="dxa"/>
             <w:shd w:val="clear" w:color="auto" w:fill="EBF3F8"/>
           </w:tcPr>
           <w:p>
@@ -8176,7 +8400,7 @@
         </w:tc>
         <w:tc>
           <w:tcPr>
-            <w:tcW w:w="4923" w:type="dxa"/>
+            <w:tcW w:w="2513" w:type="dxa"/>
             <w:shd w:val="clear" w:color="auto" w:fill="EBF3F8"/>
           </w:tcPr>
           <w:p>
@@ -8184,7 +8408,21 @@
               <w:rPr>
                 <w:sz w:val="20"/>
               </w:rPr>
-              <w:t>GitHub Actions → deploy.yml → SSH → update.sh</w:t>
+              <w:t xml:space="preserve">GitHub Actions → </w:t>
+            </w:r>
+            <w:proofErr w:type="spellStart"/>
+            <w:r>
+              <w:rPr>
+                <w:sz w:val="20"/>
+              </w:rPr>
+              <w:t>deploy.yml</w:t>
+            </w:r>
+            <w:proofErr w:type="spellEnd"/>
+            <w:r>
+              <w:rPr>
+                <w:sz w:val="20"/>
+              </w:rPr>
+              <w:t xml:space="preserve"> → SSH → update.sh</w:t>
             </w:r>
           </w:p>
         </w:tc>
@@ -8198,7 +8436,21 @@
               <w:rPr>
                 <w:sz w:val="20"/>
               </w:rPr>
-              <w:t>Same pattern — separate deploy.yml and update.sh</w:t>
+              <w:t xml:space="preserve">Same pattern — separate </w:t>
+            </w:r>
+            <w:proofErr w:type="spellStart"/>
+            <w:r>
+              <w:rPr>
+                <w:sz w:val="20"/>
+              </w:rPr>
+              <w:t>deploy.yml</w:t>
+            </w:r>
+            <w:proofErr w:type="spellEnd"/>
+            <w:r>
+              <w:rPr>
+                <w:sz w:val="20"/>
+              </w:rPr>
+              <w:t xml:space="preserve"> and update.sh</w:t>
             </w:r>
           </w:p>
         </w:tc>
@@ -8374,16 +8626,7 @@
           <w:color w:val="1F3964"/>
           <w:sz w:val="32"/>
         </w:rPr>
-        <w:lastRenderedPageBreak/>
-        <w:t>1</w:t>
-      </w:r>
-      <w:r>
-        <w:rPr>
-          <w:b/>
-          <w:color w:val="1F3964"/>
-          <w:sz w:val="32"/>
-        </w:rPr>
-        <w:t>5. Prerequisites For Reproducing the Code</w:t>
+        <w:t>15. Prerequisites For Reproducing the Code</w:t>
       </w:r>
     </w:p>
     <w:p>
@@ -8391,13 +8634,7 @@
         <w:spacing w:after="80"/>
       </w:pPr>
       <w:r>
-        <w:t xml:space="preserve">Before </w:t>
-      </w:r>
-      <w:r>
-        <w:t>we</w:t>
-      </w:r>
-      <w:r>
-        <w:t xml:space="preserve"> can reproduce the </w:t>
+        <w:t xml:space="preserve">Before we can reproduce the </w:t>
       </w:r>
       <w:proofErr w:type="gramStart"/>
       <w:r>
@@ -8405,13 +8642,7 @@
       </w:r>
       <w:proofErr w:type="gramEnd"/>
       <w:r>
-        <w:t xml:space="preserve"> </w:t>
-      </w:r>
-      <w:r>
-        <w:t>we</w:t>
-      </w:r>
-      <w:r>
-        <w:t xml:space="preserve"> need the following accounts, keys, and infrastructure in place.</w:t>
+        <w:t xml:space="preserve"> we need the following accounts, keys, and infrastructure in place.</w:t>
       </w:r>
     </w:p>
     <w:p>
@@ -8425,23 +8656,7 @@
           <w:color w:val="1F7A8C"/>
           <w:sz w:val="26"/>
         </w:rPr>
-        <w:t>1.</w:t>
-      </w:r>
-      <w:r>
-        <w:rPr>
-          <w:b/>
-          <w:color w:val="1F7A8C"/>
-          <w:sz w:val="26"/>
-        </w:rPr>
-        <w:t>1</w:t>
-      </w:r>
-      <w:r>
-        <w:rPr>
-          <w:b/>
-          <w:color w:val="1F7A8C"/>
-          <w:sz w:val="26"/>
-        </w:rPr>
-        <w:t xml:space="preserve">  API</w:t>
+        <w:t>1.1  API</w:t>
       </w:r>
       <w:proofErr w:type="gramEnd"/>
       <w:r>
@@ -8682,31 +8897,15 @@
           <w:color w:val="1F7A8C"/>
           <w:sz w:val="26"/>
         </w:rPr>
-        <w:t>1.</w:t>
-      </w:r>
+        <w:t>1.2  Local</w:t>
+      </w:r>
+      <w:proofErr w:type="gramEnd"/>
       <w:r>
         <w:rPr>
           <w:b/>
           <w:color w:val="1F7A8C"/>
           <w:sz w:val="26"/>
         </w:rPr>
-        <w:t>2</w:t>
-      </w:r>
-      <w:r>
-        <w:rPr>
-          <w:b/>
-          <w:color w:val="1F7A8C"/>
-          <w:sz w:val="26"/>
-        </w:rPr>
-        <w:t xml:space="preserve">  Local</w:t>
-      </w:r>
-      <w:proofErr w:type="gramEnd"/>
-      <w:r>
-        <w:rPr>
-          <w:b/>
-          <w:color w:val="1F7A8C"/>
-          <w:sz w:val="26"/>
-        </w:rPr>
         <w:t xml:space="preserve"> Machine</w:t>
       </w:r>
     </w:p>
@@ -8746,13 +8945,7 @@
         <w:rPr>
           <w:sz w:val="21"/>
         </w:rPr>
-        <w:t xml:space="preserve"> </w:t>
-      </w:r>
-      <w:r>
-        <w:rPr>
-          <w:sz w:val="21"/>
-        </w:rPr>
-        <w:t>SSH client (e.g. OpenSSH or PuTTY) to connect to the server for first-time setup</w:t>
+        <w:t xml:space="preserve"> SSH client (e.g. OpenSSH or PuTTY) to connect to the server for first-time setup</w:t>
       </w:r>
     </w:p>
     <w:p>
@@ -8768,15 +8961,7 @@
           <w:color w:val="1F3964"/>
           <w:sz w:val="32"/>
         </w:rPr>
-        <w:t>16. How</w:t>
-      </w:r>
-      <w:r>
-        <w:rPr>
-          <w:b/>
-          <w:color w:val="1F3964"/>
-          <w:sz w:val="32"/>
-        </w:rPr>
-        <w:t xml:space="preserve"> to Reproduce the System End-to-End</w:t>
+        <w:t>16. How to Reproduce the System End-to-End</w:t>
       </w:r>
     </w:p>
     <w:p>
@@ -8811,6 +8996,7 @@
           <w:color w:val="1F3964"/>
           <w:sz w:val="18"/>
         </w:rPr>
+        <w:lastRenderedPageBreak/>
         <w:t>git clone https://github.com/Harikrishna2461/Cygnus_Med_Demo.git</w:t>
       </w:r>
       <w:r>
@@ -9249,7 +9435,6 @@
           <w:color w:val="1F7A8C"/>
           <w:sz w:val="26"/>
         </w:rPr>
-        <w:lastRenderedPageBreak/>
         <w:t>Step 4 — Pull the Latest Code on the Server</w:t>
       </w:r>
     </w:p>
@@ -9971,6 +10156,7 @@
           <w:color w:val="1F7A8C"/>
           <w:sz w:val="26"/>
         </w:rPr>
+        <w:lastRenderedPageBreak/>
         <w:t>Step 7 — Start the Service</w:t>
       </w:r>
     </w:p>
@@ -10240,7 +10426,6 @@
         <w:rPr>
           <w:sz w:val="21"/>
         </w:rPr>
-        <w:lastRenderedPageBreak/>
         <w:t xml:space="preserve"> Go to the GitHub repository → Settings → Secrets and variables → Actions</w:t>
       </w:r>
     </w:p>
@@ -10339,16 +10524,18 @@
           <w:sz w:val="32"/>
         </w:rPr>
         <w:lastRenderedPageBreak/>
-        <w:t>17. What</w:t>
-      </w:r>
+        <w:t xml:space="preserve">17. What Worked </w:t>
+      </w:r>
+      <w:proofErr w:type="gramStart"/>
       <w:r>
         <w:rPr>
           <w:b/>
           <w:color w:val="1F3964"/>
           <w:sz w:val="32"/>
         </w:rPr>
-        <w:t xml:space="preserve"> Worked</w:t>
-      </w:r>
+        <w:t>In</w:t>
+      </w:r>
+      <w:proofErr w:type="gramEnd"/>
       <w:r>
         <w:rPr>
           <w:b/>
@@ -10364,7 +10551,7 @@
           <w:color w:val="1F3964"/>
           <w:sz w:val="32"/>
         </w:rPr>
-        <w:t>In</w:t>
+        <w:t>The</w:t>
       </w:r>
       <w:proofErr w:type="gramEnd"/>
       <w:r>
@@ -10373,24 +10560,6 @@
           <w:color w:val="1F3964"/>
           <w:sz w:val="32"/>
         </w:rPr>
-        <w:t xml:space="preserve"> </w:t>
-      </w:r>
-      <w:proofErr w:type="gramStart"/>
-      <w:r>
-        <w:rPr>
-          <w:b/>
-          <w:color w:val="1F3964"/>
-          <w:sz w:val="32"/>
-        </w:rPr>
-        <w:t>The</w:t>
-      </w:r>
-      <w:proofErr w:type="gramEnd"/>
-      <w:r>
-        <w:rPr>
-          <w:b/>
-          <w:color w:val="1F3964"/>
-          <w:sz w:val="32"/>
-        </w:rPr>
         <w:t xml:space="preserve"> Project</w:t>
       </w:r>
     </w:p>
@@ -10405,24 +10574,459 @@
           <w:color w:val="1F7A8C"/>
           <w:sz w:val="26"/>
         </w:rPr>
-        <w:t>17</w:t>
-      </w:r>
+        <w:t>17.1  Core</w:t>
+      </w:r>
+      <w:proofErr w:type="gramEnd"/>
       <w:r>
         <w:rPr>
           <w:b/>
           <w:color w:val="1F7A8C"/>
           <w:sz w:val="26"/>
         </w:rPr>
-        <w:t>.1  Core</w:t>
+        <w:t xml:space="preserve"> Application Architecture</w:t>
+      </w:r>
+    </w:p>
+    <w:p>
+      <w:pPr>
+        <w:pStyle w:val="ListBullet"/>
+        <w:spacing w:after="40"/>
+        <w:ind w:left="432"/>
+        <w:rPr>
+          <w:color w:val="000000" w:themeColor="text1"/>
+        </w:rPr>
+      </w:pPr>
+      <w:r>
+        <w:rPr>
+          <w:color w:val="1E6B2E"/>
+          <w:sz w:val="21"/>
+        </w:rPr>
+        <w:t xml:space="preserve">  </w:t>
+      </w:r>
+      <w:r>
+        <w:rPr>
+          <w:color w:val="000000" w:themeColor="text1"/>
+          <w:sz w:val="21"/>
+        </w:rPr>
+        <w:t>Flask + Flask-</w:t>
+      </w:r>
+      <w:proofErr w:type="spellStart"/>
+      <w:r>
+        <w:rPr>
+          <w:color w:val="000000" w:themeColor="text1"/>
+          <w:sz w:val="21"/>
+        </w:rPr>
+        <w:t>SocketIO</w:t>
+      </w:r>
+      <w:proofErr w:type="spellEnd"/>
+      <w:r>
+        <w:rPr>
+          <w:color w:val="000000" w:themeColor="text1"/>
+          <w:sz w:val="21"/>
+        </w:rPr>
+        <w:t xml:space="preserve"> with </w:t>
+      </w:r>
+      <w:proofErr w:type="spellStart"/>
+      <w:r>
+        <w:rPr>
+          <w:color w:val="000000" w:themeColor="text1"/>
+          <w:sz w:val="21"/>
+        </w:rPr>
+        <w:t>async_mode</w:t>
+      </w:r>
+      <w:proofErr w:type="spellEnd"/>
+      <w:r>
+        <w:rPr>
+          <w:color w:val="000000" w:themeColor="text1"/>
+          <w:sz w:val="21"/>
+        </w:rPr>
+        <w:t>='</w:t>
+      </w:r>
+      <w:proofErr w:type="gramStart"/>
+      <w:r>
+        <w:rPr>
+          <w:color w:val="000000" w:themeColor="text1"/>
+          <w:sz w:val="21"/>
+        </w:rPr>
+        <w:t>threading' —</w:t>
       </w:r>
       <w:proofErr w:type="gramEnd"/>
+      <w:r>
+        <w:rPr>
+          <w:color w:val="000000" w:themeColor="text1"/>
+          <w:sz w:val="21"/>
+        </w:rPr>
+        <w:t xml:space="preserve"> stable under concurrent WebSocket connections and does not require an async event loop (</w:t>
+      </w:r>
+      <w:proofErr w:type="spellStart"/>
+      <w:r>
+        <w:rPr>
+          <w:color w:val="000000" w:themeColor="text1"/>
+          <w:sz w:val="21"/>
+        </w:rPr>
+        <w:t>asyncio</w:t>
+      </w:r>
+      <w:proofErr w:type="spellEnd"/>
+      <w:r>
+        <w:rPr>
+          <w:color w:val="000000" w:themeColor="text1"/>
+          <w:sz w:val="21"/>
+        </w:rPr>
+        <w:t>/</w:t>
+      </w:r>
+      <w:proofErr w:type="spellStart"/>
+      <w:r>
+        <w:rPr>
+          <w:color w:val="000000" w:themeColor="text1"/>
+          <w:sz w:val="21"/>
+        </w:rPr>
+        <w:t>gevent</w:t>
+      </w:r>
+      <w:proofErr w:type="spellEnd"/>
+      <w:r>
+        <w:rPr>
+          <w:color w:val="000000" w:themeColor="text1"/>
+          <w:sz w:val="21"/>
+        </w:rPr>
+        <w:t xml:space="preserve">), which would conflict with </w:t>
+      </w:r>
+      <w:proofErr w:type="spellStart"/>
+      <w:r>
+        <w:rPr>
+          <w:color w:val="000000" w:themeColor="text1"/>
+          <w:sz w:val="21"/>
+        </w:rPr>
+        <w:t>CrewAI's</w:t>
+      </w:r>
+      <w:proofErr w:type="spellEnd"/>
+      <w:r>
+        <w:rPr>
+          <w:color w:val="000000" w:themeColor="text1"/>
+          <w:sz w:val="21"/>
+        </w:rPr>
+        <w:t xml:space="preserve"> synchronous </w:t>
+      </w:r>
+      <w:proofErr w:type="spellStart"/>
+      <w:r>
+        <w:rPr>
+          <w:color w:val="000000" w:themeColor="text1"/>
+          <w:sz w:val="21"/>
+        </w:rPr>
+        <w:t>Groq</w:t>
+      </w:r>
+      <w:proofErr w:type="spellEnd"/>
+      <w:r>
+        <w:rPr>
+          <w:color w:val="000000" w:themeColor="text1"/>
+          <w:sz w:val="21"/>
+        </w:rPr>
+        <w:t xml:space="preserve"> calls.</w:t>
+      </w:r>
+    </w:p>
+    <w:p>
+      <w:pPr>
+        <w:pStyle w:val="ListBullet"/>
+        <w:spacing w:after="40"/>
+        <w:ind w:left="432"/>
+        <w:rPr>
+          <w:color w:val="000000" w:themeColor="text1"/>
+        </w:rPr>
+      </w:pPr>
+      <w:r>
+        <w:rPr>
+          <w:color w:val="000000" w:themeColor="text1"/>
+          <w:sz w:val="21"/>
+        </w:rPr>
+        <w:t xml:space="preserve">  simple-</w:t>
+      </w:r>
+      <w:proofErr w:type="spellStart"/>
+      <w:r>
+        <w:rPr>
+          <w:color w:val="000000" w:themeColor="text1"/>
+          <w:sz w:val="21"/>
+        </w:rPr>
+        <w:t>websocket</w:t>
+      </w:r>
+      <w:proofErr w:type="spellEnd"/>
+      <w:r>
+        <w:rPr>
+          <w:color w:val="000000" w:themeColor="text1"/>
+          <w:sz w:val="21"/>
+        </w:rPr>
+        <w:t xml:space="preserve"> transport — lighter than </w:t>
+      </w:r>
+      <w:proofErr w:type="spellStart"/>
+      <w:r>
+        <w:rPr>
+          <w:color w:val="000000" w:themeColor="text1"/>
+          <w:sz w:val="21"/>
+        </w:rPr>
+        <w:t>gevent-websocket</w:t>
+      </w:r>
+      <w:proofErr w:type="spellEnd"/>
+      <w:r>
+        <w:rPr>
+          <w:color w:val="000000" w:themeColor="text1"/>
+          <w:sz w:val="21"/>
+        </w:rPr>
+        <w:t xml:space="preserve"> and compatible with the threading mode; no C-extension compile step needed on the server.</w:t>
+      </w:r>
+    </w:p>
+    <w:p>
+      <w:pPr>
+        <w:pStyle w:val="ListBullet"/>
+        <w:spacing w:after="40"/>
+        <w:ind w:left="432"/>
+        <w:rPr>
+          <w:color w:val="000000" w:themeColor="text1"/>
+        </w:rPr>
+      </w:pPr>
+      <w:r>
+        <w:rPr>
+          <w:color w:val="000000" w:themeColor="text1"/>
+          <w:sz w:val="21"/>
+        </w:rPr>
+        <w:t xml:space="preserve">  </w:t>
+      </w:r>
+      <w:proofErr w:type="spellStart"/>
+      <w:r>
+        <w:rPr>
+          <w:color w:val="000000" w:themeColor="text1"/>
+          <w:sz w:val="21"/>
+        </w:rPr>
+        <w:t>CrewAI</w:t>
+      </w:r>
+      <w:proofErr w:type="spellEnd"/>
+      <w:r>
+        <w:rPr>
+          <w:color w:val="000000" w:themeColor="text1"/>
+          <w:sz w:val="21"/>
+        </w:rPr>
+        <w:t xml:space="preserve"> 5-agent sequential pipeline — agents reliably pass context to each other via the task context= parameter; agent 5 (guidance specialist) consistently produces valid JSON from the combined output of agents 1-4.</w:t>
+      </w:r>
+    </w:p>
+    <w:p>
+      <w:pPr>
+        <w:pStyle w:val="ListBullet"/>
+        <w:spacing w:after="40"/>
+        <w:ind w:left="432"/>
+        <w:rPr>
+          <w:color w:val="000000" w:themeColor="text1"/>
+        </w:rPr>
+      </w:pPr>
+      <w:r>
+        <w:rPr>
+          <w:color w:val="000000" w:themeColor="text1"/>
+          <w:sz w:val="21"/>
+        </w:rPr>
+        <w:t xml:space="preserve">  </w:t>
+      </w:r>
+      <w:proofErr w:type="spellStart"/>
+      <w:r>
+        <w:rPr>
+          <w:color w:val="000000" w:themeColor="text1"/>
+          <w:sz w:val="21"/>
+        </w:rPr>
+        <w:t>LiteLLM</w:t>
+      </w:r>
+      <w:proofErr w:type="spellEnd"/>
+      <w:r>
+        <w:rPr>
+          <w:color w:val="000000" w:themeColor="text1"/>
+          <w:sz w:val="21"/>
+        </w:rPr>
+        <w:t xml:space="preserve"> monkey-patch for </w:t>
+      </w:r>
+      <w:proofErr w:type="spellStart"/>
+      <w:r>
+        <w:rPr>
+          <w:color w:val="000000" w:themeColor="text1"/>
+          <w:sz w:val="21"/>
+        </w:rPr>
+        <w:t>Groq</w:t>
+      </w:r>
+      <w:proofErr w:type="spellEnd"/>
+      <w:r>
+        <w:rPr>
+          <w:color w:val="000000" w:themeColor="text1"/>
+          <w:sz w:val="21"/>
+        </w:rPr>
+        <w:t xml:space="preserve"> — stripping the </w:t>
+      </w:r>
+      <w:proofErr w:type="spellStart"/>
+      <w:r>
+        <w:rPr>
+          <w:color w:val="000000" w:themeColor="text1"/>
+          <w:sz w:val="21"/>
+        </w:rPr>
+        <w:t>cache_breakpoint</w:t>
+      </w:r>
+      <w:proofErr w:type="spellEnd"/>
+      <w:r>
+        <w:rPr>
+          <w:color w:val="000000" w:themeColor="text1"/>
+          <w:sz w:val="21"/>
+        </w:rPr>
+        <w:t xml:space="preserve"> field from </w:t>
+      </w:r>
+      <w:proofErr w:type="spellStart"/>
+      <w:r>
+        <w:rPr>
+          <w:color w:val="000000" w:themeColor="text1"/>
+          <w:sz w:val="21"/>
+        </w:rPr>
+        <w:t>LiteLLM's</w:t>
+      </w:r>
+      <w:proofErr w:type="spellEnd"/>
+      <w:r>
+        <w:rPr>
+          <w:color w:val="000000" w:themeColor="text1"/>
+          <w:sz w:val="21"/>
+        </w:rPr>
+        <w:t xml:space="preserve"> request before it reaches </w:t>
+      </w:r>
+      <w:proofErr w:type="spellStart"/>
+      <w:r>
+        <w:rPr>
+          <w:color w:val="000000" w:themeColor="text1"/>
+          <w:sz w:val="21"/>
+        </w:rPr>
+        <w:t>Groq</w:t>
+      </w:r>
+      <w:proofErr w:type="spellEnd"/>
+      <w:r>
+        <w:rPr>
+          <w:color w:val="000000" w:themeColor="text1"/>
+          <w:sz w:val="21"/>
+        </w:rPr>
+        <w:t xml:space="preserve"> resolved a silent 400 error that caused the crew to silently fail. This one-line patch in crew_pipeline.py was robust across all test scenarios.</w:t>
+      </w:r>
+    </w:p>
+    <w:p>
+      <w:pPr>
+        <w:pStyle w:val="ListBullet"/>
+        <w:spacing w:after="40"/>
+        <w:ind w:left="432"/>
+        <w:rPr>
+          <w:color w:val="000000" w:themeColor="text1"/>
+        </w:rPr>
+      </w:pPr>
+      <w:r>
+        <w:rPr>
+          <w:color w:val="000000" w:themeColor="text1"/>
+          <w:sz w:val="21"/>
+        </w:rPr>
+        <w:t xml:space="preserve">  Sub-agents (history, </w:t>
+      </w:r>
+      <w:proofErr w:type="spellStart"/>
+      <w:r>
+        <w:rPr>
+          <w:color w:val="000000" w:themeColor="text1"/>
+          <w:sz w:val="21"/>
+        </w:rPr>
+        <w:t>q_state</w:t>
+      </w:r>
+      <w:proofErr w:type="spellEnd"/>
+      <w:r>
+        <w:rPr>
+          <w:color w:val="000000" w:themeColor="text1"/>
+          <w:sz w:val="21"/>
+        </w:rPr>
+        <w:t xml:space="preserve">, protocol) as plain Python functions — keeping these outside </w:t>
+      </w:r>
+      <w:proofErr w:type="spellStart"/>
+      <w:r>
+        <w:rPr>
+          <w:color w:val="000000" w:themeColor="text1"/>
+          <w:sz w:val="21"/>
+        </w:rPr>
+        <w:t>CrewAI</w:t>
+      </w:r>
+      <w:proofErr w:type="spellEnd"/>
+      <w:r>
+        <w:rPr>
+          <w:color w:val="000000" w:themeColor="text1"/>
+          <w:sz w:val="21"/>
+        </w:rPr>
+        <w:t xml:space="preserve"> avoids unnecessary LLM calls for logic that is deterministic (Q-state derivation, protocol lookup) or needs to run before the crew.</w:t>
+      </w:r>
+    </w:p>
+    <w:p>
+      <w:pPr>
+        <w:pStyle w:val="ListBullet"/>
+        <w:spacing w:after="40"/>
+        <w:ind w:left="432"/>
+        <w:rPr>
+          <w:color w:val="000000" w:themeColor="text1"/>
+        </w:rPr>
+      </w:pPr>
+      <w:r>
+        <w:rPr>
+          <w:color w:val="000000" w:themeColor="text1"/>
+          <w:sz w:val="21"/>
+        </w:rPr>
+        <w:t xml:space="preserve">  </w:t>
+      </w:r>
+      <w:proofErr w:type="spellStart"/>
+      <w:r>
+        <w:rPr>
+          <w:color w:val="000000" w:themeColor="text1"/>
+          <w:sz w:val="21"/>
+        </w:rPr>
+        <w:t>Groq</w:t>
+      </w:r>
+      <w:proofErr w:type="spellEnd"/>
+      <w:r>
+        <w:rPr>
+          <w:color w:val="000000" w:themeColor="text1"/>
+          <w:sz w:val="21"/>
+        </w:rPr>
+        <w:t xml:space="preserve"> llama-3.3-70b-versatile for text agents — fast inference (&lt;3 s per crew run) with consistent JSON output when given strict output schemas in the task prompts.</w:t>
+      </w:r>
+    </w:p>
+    <w:p>
+      <w:pPr>
+        <w:pStyle w:val="ListBullet"/>
+        <w:spacing w:after="40"/>
+        <w:ind w:left="432"/>
+        <w:rPr>
+          <w:color w:val="000000" w:themeColor="text1"/>
+        </w:rPr>
+      </w:pPr>
+      <w:r>
+        <w:rPr>
+          <w:color w:val="000000" w:themeColor="text1"/>
+          <w:sz w:val="21"/>
+        </w:rPr>
+        <w:t xml:space="preserve">  </w:t>
+      </w:r>
+      <w:proofErr w:type="spellStart"/>
+      <w:r>
+        <w:rPr>
+          <w:color w:val="000000" w:themeColor="text1"/>
+          <w:sz w:val="21"/>
+        </w:rPr>
+        <w:t>Groq</w:t>
+      </w:r>
+      <w:proofErr w:type="spellEnd"/>
+      <w:r>
+        <w:rPr>
+          <w:color w:val="000000" w:themeColor="text1"/>
+          <w:sz w:val="21"/>
+        </w:rPr>
+        <w:t xml:space="preserve"> llama-4-scout-17b for VLM — correctly identifies fascial layer visibility and N1/N2/N3 needle positions from annotated ultrasound frames.</w:t>
+      </w:r>
+    </w:p>
+    <w:p>
+      <w:pPr>
+        <w:spacing w:before="200" w:after="60"/>
+      </w:pPr>
       <w:r>
         <w:rPr>
           <w:b/>
           <w:color w:val="1F7A8C"/>
           <w:sz w:val="26"/>
         </w:rPr>
-        <w:t xml:space="preserve"> Application Architecture</w:t>
+        <w:t>17.2 Deployment Infrastructure</w:t>
       </w:r>
     </w:p>
     <w:p>
@@ -10441,124 +11045,53 @@
         </w:rPr>
         <w:t xml:space="preserve">  </w:t>
       </w:r>
+      <w:proofErr w:type="spellStart"/>
       <w:r>
         <w:rPr>
           <w:color w:val="000000" w:themeColor="text1"/>
           <w:sz w:val="21"/>
         </w:rPr>
-        <w:t>Flask + Flask-</w:t>
-      </w:r>
-      <w:proofErr w:type="spellStart"/>
+        <w:t>systemd</w:t>
+      </w:r>
+      <w:proofErr w:type="spellEnd"/>
       <w:r>
         <w:rPr>
           <w:color w:val="000000" w:themeColor="text1"/>
           <w:sz w:val="21"/>
         </w:rPr>
-        <w:t>SocketIO</w:t>
-      </w:r>
-      <w:proofErr w:type="spellEnd"/>
+        <w:t xml:space="preserve"> service with </w:t>
+      </w:r>
+      <w:proofErr w:type="spellStart"/>
       <w:r>
         <w:rPr>
           <w:color w:val="000000" w:themeColor="text1"/>
           <w:sz w:val="21"/>
         </w:rPr>
-        <w:t xml:space="preserve"> with </w:t>
-      </w:r>
-      <w:proofErr w:type="spellStart"/>
+        <w:t>ExecStartPre</w:t>
+      </w:r>
+      <w:proofErr w:type="spellEnd"/>
       <w:r>
         <w:rPr>
           <w:color w:val="000000" w:themeColor="text1"/>
           <w:sz w:val="21"/>
         </w:rPr>
-        <w:t>async_mode</w:t>
-      </w:r>
-      <w:proofErr w:type="spellEnd"/>
+        <w:t xml:space="preserve"> for git pull + pip install — ensures the server is always on the latest committed code before </w:t>
+      </w:r>
+      <w:proofErr w:type="spellStart"/>
       <w:r>
         <w:rPr>
           <w:color w:val="000000" w:themeColor="text1"/>
           <w:sz w:val="21"/>
         </w:rPr>
-        <w:t>='</w:t>
-      </w:r>
-      <w:proofErr w:type="gramStart"/>
+        <w:t>Gunicorn</w:t>
+      </w:r>
+      <w:proofErr w:type="spellEnd"/>
       <w:r>
         <w:rPr>
           <w:color w:val="000000" w:themeColor="text1"/>
           <w:sz w:val="21"/>
         </w:rPr>
-        <w:t>threading' —</w:t>
-      </w:r>
-      <w:proofErr w:type="gramEnd"/>
-      <w:r>
-        <w:rPr>
-          <w:color w:val="000000" w:themeColor="text1"/>
-          <w:sz w:val="21"/>
-        </w:rPr>
-        <w:t xml:space="preserve"> stable under concurrent WebSocket connections and does not require an async event loop (</w:t>
-      </w:r>
-      <w:proofErr w:type="spellStart"/>
-      <w:r>
-        <w:rPr>
-          <w:color w:val="000000" w:themeColor="text1"/>
-          <w:sz w:val="21"/>
-        </w:rPr>
-        <w:t>asyncio</w:t>
-      </w:r>
-      <w:proofErr w:type="spellEnd"/>
-      <w:r>
-        <w:rPr>
-          <w:color w:val="000000" w:themeColor="text1"/>
-          <w:sz w:val="21"/>
-        </w:rPr>
-        <w:t>/</w:t>
-      </w:r>
-      <w:proofErr w:type="spellStart"/>
-      <w:r>
-        <w:rPr>
-          <w:color w:val="000000" w:themeColor="text1"/>
-          <w:sz w:val="21"/>
-        </w:rPr>
-        <w:t>gevent</w:t>
-      </w:r>
-      <w:proofErr w:type="spellEnd"/>
-      <w:r>
-        <w:rPr>
-          <w:color w:val="000000" w:themeColor="text1"/>
-          <w:sz w:val="21"/>
-        </w:rPr>
-        <w:t xml:space="preserve">), which would conflict with </w:t>
-      </w:r>
-      <w:proofErr w:type="spellStart"/>
-      <w:r>
-        <w:rPr>
-          <w:color w:val="000000" w:themeColor="text1"/>
-          <w:sz w:val="21"/>
-        </w:rPr>
-        <w:t>CrewAI's</w:t>
-      </w:r>
-      <w:proofErr w:type="spellEnd"/>
-      <w:r>
-        <w:rPr>
-          <w:color w:val="000000" w:themeColor="text1"/>
-          <w:sz w:val="21"/>
-        </w:rPr>
-        <w:t xml:space="preserve"> synchronous </w:t>
-      </w:r>
-      <w:proofErr w:type="spellStart"/>
-      <w:r>
-        <w:rPr>
-          <w:color w:val="000000" w:themeColor="text1"/>
-          <w:sz w:val="21"/>
-        </w:rPr>
-        <w:t>Groq</w:t>
-      </w:r>
-      <w:proofErr w:type="spellEnd"/>
-      <w:r>
-        <w:rPr>
-          <w:color w:val="000000" w:themeColor="text1"/>
-          <w:sz w:val="21"/>
-        </w:rPr>
-        <w:t xml:space="preserve"> calls.</w:t>
+        <w:t xml:space="preserve"> starts, without needing a separate deployment pipeline.</w:t>
       </w:r>
     </w:p>
     <w:p>
@@ -10575,7 +11108,7 @@
           <w:color w:val="000000" w:themeColor="text1"/>
           <w:sz w:val="21"/>
         </w:rPr>
-        <w:t xml:space="preserve">  simple-</w:t>
+        <w:t xml:space="preserve">  </w:t>
       </w:r>
       <w:proofErr w:type="spellStart"/>
       <w:r>
@@ -10583,7 +11116,7 @@
           <w:color w:val="000000" w:themeColor="text1"/>
           <w:sz w:val="21"/>
         </w:rPr>
-        <w:t>websocket</w:t>
+        <w:t>Gunicorn</w:t>
       </w:r>
       <w:proofErr w:type="spellEnd"/>
       <w:r>
@@ -10591,7 +11124,7 @@
           <w:color w:val="000000" w:themeColor="text1"/>
           <w:sz w:val="21"/>
         </w:rPr>
-        <w:t xml:space="preserve"> transport — lighter than </w:t>
+        <w:t xml:space="preserve"> with </w:t>
       </w:r>
       <w:proofErr w:type="spellStart"/>
       <w:r>
@@ -10599,7 +11132,7 @@
           <w:color w:val="000000" w:themeColor="text1"/>
           <w:sz w:val="21"/>
         </w:rPr>
-        <w:t>gevent-websocket</w:t>
+        <w:t>worker_class</w:t>
       </w:r>
       <w:proofErr w:type="spellEnd"/>
       <w:r>
@@ -10607,7 +11140,71 @@
           <w:color w:val="000000" w:themeColor="text1"/>
           <w:sz w:val="21"/>
         </w:rPr>
-        <w:t xml:space="preserve"> and compatible with the threading mode; no C-extension compile step needed on the server.</w:t>
+        <w:t>='</w:t>
+      </w:r>
+      <w:proofErr w:type="spellStart"/>
+      <w:r>
+        <w:rPr>
+          <w:color w:val="000000" w:themeColor="text1"/>
+          <w:sz w:val="21"/>
+        </w:rPr>
+        <w:t>gthread</w:t>
+      </w:r>
+      <w:proofErr w:type="spellEnd"/>
+      <w:r>
+        <w:rPr>
+          <w:color w:val="000000" w:themeColor="text1"/>
+          <w:sz w:val="21"/>
+        </w:rPr>
+        <w:t xml:space="preserve">' and threads=4 — the only </w:t>
+      </w:r>
+      <w:proofErr w:type="spellStart"/>
+      <w:r>
+        <w:rPr>
+          <w:color w:val="000000" w:themeColor="text1"/>
+          <w:sz w:val="21"/>
+        </w:rPr>
+        <w:t>Gunicorn</w:t>
+      </w:r>
+      <w:proofErr w:type="spellEnd"/>
+      <w:r>
+        <w:rPr>
+          <w:color w:val="000000" w:themeColor="text1"/>
+          <w:sz w:val="21"/>
+        </w:rPr>
+        <w:t xml:space="preserve"> configuration that works with Flask-</w:t>
+      </w:r>
+      <w:proofErr w:type="spellStart"/>
+      <w:r>
+        <w:rPr>
+          <w:color w:val="000000" w:themeColor="text1"/>
+          <w:sz w:val="21"/>
+        </w:rPr>
+        <w:t>SocketIO</w:t>
+      </w:r>
+      <w:proofErr w:type="spellEnd"/>
+      <w:r>
+        <w:rPr>
+          <w:color w:val="000000" w:themeColor="text1"/>
+          <w:sz w:val="21"/>
+        </w:rPr>
+        <w:t xml:space="preserve"> threading mode; sync and </w:t>
+      </w:r>
+      <w:proofErr w:type="spellStart"/>
+      <w:r>
+        <w:rPr>
+          <w:color w:val="000000" w:themeColor="text1"/>
+          <w:sz w:val="21"/>
+        </w:rPr>
+        <w:t>gevent</w:t>
+      </w:r>
+      <w:proofErr w:type="spellEnd"/>
+      <w:r>
+        <w:rPr>
+          <w:color w:val="000000" w:themeColor="text1"/>
+          <w:sz w:val="21"/>
+        </w:rPr>
+        <w:t xml:space="preserve"> workers both failed.</w:t>
       </w:r>
     </w:p>
     <w:p>
@@ -10624,7 +11221,7 @@
           <w:color w:val="000000" w:themeColor="text1"/>
           <w:sz w:val="21"/>
         </w:rPr>
-        <w:t xml:space="preserve">  </w:t>
+        <w:t xml:space="preserve">  Unix socket for </w:t>
       </w:r>
       <w:proofErr w:type="spellStart"/>
       <w:r>
@@ -10632,7 +11229,7 @@
           <w:color w:val="000000" w:themeColor="text1"/>
           <w:sz w:val="21"/>
         </w:rPr>
-        <w:t>CrewAI</w:t>
+        <w:t>Gunicorn↔Nginx</w:t>
       </w:r>
       <w:proofErr w:type="spellEnd"/>
       <w:r>
@@ -10640,7 +11237,25 @@
           <w:color w:val="000000" w:themeColor="text1"/>
           <w:sz w:val="21"/>
         </w:rPr>
-        <w:t xml:space="preserve"> 5-agent sequential pipeline — agents reliably pass context to each other via the task context= parameter; agent 5 (guidance specialist) consistently produces valid JSON from the combined output of agents 1-4.</w:t>
+        <w:t xml:space="preserve"> IPC (task2.sock) — lower latency than TCP </w:t>
+      </w:r>
+      <w:proofErr w:type="spellStart"/>
+      <w:proofErr w:type="gramStart"/>
+      <w:r>
+        <w:rPr>
+          <w:color w:val="000000" w:themeColor="text1"/>
+          <w:sz w:val="21"/>
+        </w:rPr>
+        <w:t>localhost:port</w:t>
+      </w:r>
+      <w:proofErr w:type="spellEnd"/>
+      <w:proofErr w:type="gramEnd"/>
+      <w:r>
+        <w:rPr>
+          <w:color w:val="000000" w:themeColor="text1"/>
+          <w:sz w:val="21"/>
+        </w:rPr>
+        <w:t xml:space="preserve"> and avoids port conflicts when multiple apps run on the same server.</w:t>
       </w:r>
     </w:p>
     <w:p>
@@ -10657,87 +11272,7 @@
           <w:color w:val="000000" w:themeColor="text1"/>
           <w:sz w:val="21"/>
         </w:rPr>
-        <w:t xml:space="preserve">  </w:t>
-      </w:r>
-      <w:proofErr w:type="spellStart"/>
-      <w:r>
-        <w:rPr>
-          <w:color w:val="000000" w:themeColor="text1"/>
-          <w:sz w:val="21"/>
-        </w:rPr>
-        <w:t>LiteLLM</w:t>
-      </w:r>
-      <w:proofErr w:type="spellEnd"/>
-      <w:r>
-        <w:rPr>
-          <w:color w:val="000000" w:themeColor="text1"/>
-          <w:sz w:val="21"/>
-        </w:rPr>
-        <w:t xml:space="preserve"> monkey-patch for </w:t>
-      </w:r>
-      <w:proofErr w:type="spellStart"/>
-      <w:r>
-        <w:rPr>
-          <w:color w:val="000000" w:themeColor="text1"/>
-          <w:sz w:val="21"/>
-        </w:rPr>
-        <w:t>Groq</w:t>
-      </w:r>
-      <w:proofErr w:type="spellEnd"/>
-      <w:r>
-        <w:rPr>
-          <w:color w:val="000000" w:themeColor="text1"/>
-          <w:sz w:val="21"/>
-        </w:rPr>
-        <w:t xml:space="preserve"> — stripping the </w:t>
-      </w:r>
-      <w:proofErr w:type="spellStart"/>
-      <w:r>
-        <w:rPr>
-          <w:color w:val="000000" w:themeColor="text1"/>
-          <w:sz w:val="21"/>
-        </w:rPr>
-        <w:t>cache_breakpoint</w:t>
-      </w:r>
-      <w:proofErr w:type="spellEnd"/>
-      <w:r>
-        <w:rPr>
-          <w:color w:val="000000" w:themeColor="text1"/>
-          <w:sz w:val="21"/>
-        </w:rPr>
-        <w:t xml:space="preserve"> field from </w:t>
-      </w:r>
-      <w:proofErr w:type="spellStart"/>
-      <w:r>
-        <w:rPr>
-          <w:color w:val="000000" w:themeColor="text1"/>
-          <w:sz w:val="21"/>
-        </w:rPr>
-        <w:t>LiteLLM's</w:t>
-      </w:r>
-      <w:proofErr w:type="spellEnd"/>
-      <w:r>
-        <w:rPr>
-          <w:color w:val="000000" w:themeColor="text1"/>
-          <w:sz w:val="21"/>
-        </w:rPr>
-        <w:t xml:space="preserve"> request before it reaches </w:t>
-      </w:r>
-      <w:proofErr w:type="spellStart"/>
-      <w:r>
-        <w:rPr>
-          <w:color w:val="000000" w:themeColor="text1"/>
-          <w:sz w:val="21"/>
-        </w:rPr>
-        <w:t>Groq</w:t>
-      </w:r>
-      <w:proofErr w:type="spellEnd"/>
-      <w:r>
-        <w:rPr>
-          <w:color w:val="000000" w:themeColor="text1"/>
-          <w:sz w:val="21"/>
-        </w:rPr>
-        <w:t xml:space="preserve"> resolved a silent 400 error that caused the crew to silently fail. This one-line patch in crew_pipeline.py was robust across all test scenarios.</w:t>
+        <w:t xml:space="preserve">  Nginx WebSocket proxy with Upgrade + Connection headers — without these two headers the WebSocket handshake fails silently; adding them resolved all WebSocket connectivity issues.</w:t>
       </w:r>
     </w:p>
     <w:p>
@@ -10754,7 +11289,7 @@
           <w:color w:val="000000" w:themeColor="text1"/>
           <w:sz w:val="21"/>
         </w:rPr>
-        <w:t xml:space="preserve">  Sub-agents (history, </w:t>
+        <w:t xml:space="preserve">  Port 8080 for Task-2 alongside Task-1 on port 80 — two independent </w:t>
       </w:r>
       <w:proofErr w:type="spellStart"/>
       <w:r>
@@ -10762,7 +11297,7 @@
           <w:color w:val="000000" w:themeColor="text1"/>
           <w:sz w:val="21"/>
         </w:rPr>
-        <w:t>q_state</w:t>
+        <w:t>systemd</w:t>
       </w:r>
       <w:proofErr w:type="spellEnd"/>
       <w:r>
@@ -10770,23 +11305,7 @@
           <w:color w:val="000000" w:themeColor="text1"/>
           <w:sz w:val="21"/>
         </w:rPr>
-        <w:t xml:space="preserve">, protocol) as plain Python functions — keeping these outside </w:t>
-      </w:r>
-      <w:proofErr w:type="spellStart"/>
-      <w:r>
-        <w:rPr>
-          <w:color w:val="000000" w:themeColor="text1"/>
-          <w:sz w:val="21"/>
-        </w:rPr>
-        <w:t>CrewAI</w:t>
-      </w:r>
-      <w:proofErr w:type="spellEnd"/>
-      <w:r>
-        <w:rPr>
-          <w:color w:val="000000" w:themeColor="text1"/>
-          <w:sz w:val="21"/>
-        </w:rPr>
-        <w:t xml:space="preserve"> avoids unnecessary LLM calls for logic that is deterministic (Q-state derivation, protocol lookup) or needs to run before the crew.</w:t>
+        <w:t xml:space="preserve"> services (task1 and task2), two Unix sockets, two Nginx server blocks coexist cleanly with no interference.</w:t>
       </w:r>
     </w:p>
     <w:p>
@@ -10803,23 +11322,55 @@
           <w:color w:val="000000" w:themeColor="text1"/>
           <w:sz w:val="21"/>
         </w:rPr>
-        <w:t xml:space="preserve">  </w:t>
-      </w:r>
-      <w:proofErr w:type="spellStart"/>
+        <w:t xml:space="preserve">  GitHub Actions SSH deploy (</w:t>
+      </w:r>
+      <w:proofErr w:type="gramStart"/>
       <w:r>
         <w:rPr>
           <w:color w:val="000000" w:themeColor="text1"/>
           <w:sz w:val="21"/>
         </w:rPr>
-        <w:t>Groq</w:t>
-      </w:r>
-      <w:proofErr w:type="spellEnd"/>
+        <w:t>.</w:t>
+      </w:r>
+      <w:proofErr w:type="spellStart"/>
       <w:r>
         <w:rPr>
           <w:color w:val="000000" w:themeColor="text1"/>
           <w:sz w:val="21"/>
         </w:rPr>
-        <w:t xml:space="preserve"> llama-3.3-70b-versatile for text agents — fast inference (&lt;3 s per crew run) with consistent JSON output when given strict output schemas in the task prompts.</w:t>
+        <w:t>github</w:t>
+      </w:r>
+      <w:proofErr w:type="spellEnd"/>
+      <w:r>
+        <w:rPr>
+          <w:color w:val="000000" w:themeColor="text1"/>
+          <w:sz w:val="21"/>
+        </w:rPr>
+        <w:t>/workflows/</w:t>
+      </w:r>
+      <w:proofErr w:type="spellStart"/>
+      <w:r>
+        <w:rPr>
+          <w:color w:val="000000" w:themeColor="text1"/>
+          <w:sz w:val="21"/>
+        </w:rPr>
+        <w:t>deploy.yml</w:t>
+      </w:r>
+      <w:proofErr w:type="spellEnd"/>
+      <w:r>
+        <w:rPr>
+          <w:color w:val="000000" w:themeColor="text1"/>
+          <w:sz w:val="21"/>
+        </w:rPr>
+        <w:t>) —</w:t>
+      </w:r>
+      <w:proofErr w:type="gramEnd"/>
+      <w:r>
+        <w:rPr>
+          <w:color w:val="000000" w:themeColor="text1"/>
+          <w:sz w:val="21"/>
+        </w:rPr>
+        <w:t xml:space="preserve"> push-to-deploy pipeline works reliably; the update.sh script is idempotent so repeated pushes do not break anything.</w:t>
       </w:r>
     </w:p>
     <w:p>
@@ -10836,45 +11387,93 @@
           <w:color w:val="000000" w:themeColor="text1"/>
           <w:sz w:val="21"/>
         </w:rPr>
-        <w:t xml:space="preserve">  </w:t>
-      </w:r>
-      <w:proofErr w:type="spellStart"/>
+        <w:t xml:space="preserve"> libgl1 system package (apt-get install -y </w:t>
+      </w:r>
+      <w:proofErr w:type="gramStart"/>
       <w:r>
         <w:rPr>
           <w:color w:val="000000" w:themeColor="text1"/>
           <w:sz w:val="21"/>
         </w:rPr>
-        <w:t>Groq</w:t>
-      </w:r>
-      <w:proofErr w:type="spellEnd"/>
+        <w:t>libgl1) —</w:t>
+      </w:r>
+      <w:proofErr w:type="gramEnd"/>
       <w:r>
         <w:rPr>
           <w:color w:val="000000" w:themeColor="text1"/>
           <w:sz w:val="21"/>
         </w:rPr>
-        <w:t xml:space="preserve"> llama-4-scout-17b for VLM — correctly identifies fascial layer visibility and N1/N2/N3 needle positions from annotated ultrasound frames.</w:t>
+        <w:t xml:space="preserve"> once installed, OpenCV imports without error on headless Ubuntu; the fix persists across reboots and service restarts.</w:t>
+      </w:r>
+    </w:p>
+    <w:p>
+      <w:pPr>
+        <w:pStyle w:val="ListBullet"/>
+        <w:spacing w:after="40"/>
+        <w:ind w:left="432"/>
+        <w:rPr>
+          <w:color w:val="000000" w:themeColor="text1"/>
+        </w:rPr>
+      </w:pPr>
+      <w:r>
+        <w:rPr>
+          <w:color w:val="000000" w:themeColor="text1"/>
+          <w:sz w:val="21"/>
+        </w:rPr>
+        <w:t xml:space="preserve">  </w:t>
+      </w:r>
+      <w:proofErr w:type="spellStart"/>
+      <w:r>
+        <w:rPr>
+          <w:color w:val="000000" w:themeColor="text1"/>
+          <w:sz w:val="21"/>
+        </w:rPr>
+        <w:t>opencv</w:t>
+      </w:r>
+      <w:proofErr w:type="spellEnd"/>
+      <w:r>
+        <w:rPr>
+          <w:color w:val="000000" w:themeColor="text1"/>
+          <w:sz w:val="21"/>
+        </w:rPr>
+        <w:t>-python-headless in requirements.txt — the headless variant avoids pulling in GTK/Qt display libraries that are meaningless on a server and would cause import errors.</w:t>
       </w:r>
     </w:p>
     <w:p>
       <w:pPr>
         <w:spacing w:before="200" w:after="60"/>
-      </w:pPr>
-      <w:r>
         <w:rPr>
           <w:b/>
           <w:color w:val="1F7A8C"/>
           <w:sz w:val="26"/>
         </w:rPr>
-        <w:t>17.2 Deployment</w:t>
-      </w:r>
-      <w:r>
+      </w:pPr>
+    </w:p>
+    <w:p>
+      <w:pPr>
+        <w:spacing w:before="200" w:after="60"/>
         <w:rPr>
           <w:b/>
           <w:color w:val="1F7A8C"/>
           <w:sz w:val="26"/>
         </w:rPr>
-        <w:t xml:space="preserve"> Infrastructure</w:t>
-      </w:r>
+      </w:pPr>
+    </w:p>
+    <w:p>
+      <w:pPr>
+        <w:spacing w:before="200" w:after="60"/>
+      </w:pPr>
+      <w:proofErr w:type="gramStart"/>
+      <w:r>
+        <w:rPr>
+          <w:b/>
+          <w:color w:val="1F7A8C"/>
+          <w:sz w:val="26"/>
+        </w:rPr>
+        <w:lastRenderedPageBreak/>
+        <w:t>17.3  Frontend</w:t>
+      </w:r>
+      <w:proofErr w:type="gramEnd"/>
     </w:p>
     <w:p>
       <w:pPr>
@@ -10887,58 +11486,58 @@
       </w:pPr>
       <w:r>
         <w:rPr>
-          <w:color w:val="1E6B2E"/>
-          <w:sz w:val="21"/>
-        </w:rPr>
-        <w:t xml:space="preserve">  </w:t>
-      </w:r>
-      <w:proofErr w:type="spellStart"/>
-      <w:r>
-        <w:rPr>
           <w:color w:val="000000" w:themeColor="text1"/>
           <w:sz w:val="21"/>
         </w:rPr>
-        <w:t>systemd</w:t>
-      </w:r>
-      <w:proofErr w:type="spellEnd"/>
+        <w:t xml:space="preserve">  Collapsible thinking </w:t>
+      </w:r>
+      <w:proofErr w:type="gramStart"/>
       <w:r>
         <w:rPr>
           <w:color w:val="000000" w:themeColor="text1"/>
           <w:sz w:val="21"/>
         </w:rPr>
-        <w:t xml:space="preserve"> service with </w:t>
-      </w:r>
-      <w:proofErr w:type="spellStart"/>
+        <w:t>log —</w:t>
+      </w:r>
+      <w:proofErr w:type="gramEnd"/>
       <w:r>
         <w:rPr>
           <w:color w:val="000000" w:themeColor="text1"/>
           <w:sz w:val="21"/>
         </w:rPr>
-        <w:t>ExecStartPre</w:t>
-      </w:r>
-      <w:proofErr w:type="spellEnd"/>
+        <w:t xml:space="preserve"> the per-turn expandable entries (</w:t>
+      </w:r>
+      <w:proofErr w:type="spellStart"/>
       <w:r>
         <w:rPr>
           <w:color w:val="000000" w:themeColor="text1"/>
           <w:sz w:val="21"/>
         </w:rPr>
-        <w:t xml:space="preserve"> for git pull + pip install — ensures the server is always on the latest committed code before </w:t>
-      </w:r>
-      <w:proofErr w:type="spellStart"/>
+        <w:t>posY</w:t>
+      </w:r>
+      <w:proofErr w:type="spellEnd"/>
       <w:r>
         <w:rPr>
           <w:color w:val="000000" w:themeColor="text1"/>
           <w:sz w:val="21"/>
         </w:rPr>
-        <w:t>Gunicorn</w:t>
-      </w:r>
-      <w:proofErr w:type="spellEnd"/>
+        <w:t xml:space="preserve">, region, raw state message, raw LLM response) are essential for debugging crew </w:t>
+      </w:r>
+      <w:proofErr w:type="spellStart"/>
       <w:r>
         <w:rPr>
           <w:color w:val="000000" w:themeColor="text1"/>
           <w:sz w:val="21"/>
         </w:rPr>
-        <w:t xml:space="preserve"> starts, without needing a separate deployment pipeline.</w:t>
+        <w:t>behaviour</w:t>
+      </w:r>
+      <w:proofErr w:type="spellEnd"/>
+      <w:r>
+        <w:rPr>
+          <w:color w:val="000000" w:themeColor="text1"/>
+          <w:sz w:val="21"/>
+        </w:rPr>
+        <w:t xml:space="preserve"> without cluttering the UI.</w:t>
       </w:r>
     </w:p>
     <w:p>
@@ -10955,538 +11554,53 @@
           <w:color w:val="000000" w:themeColor="text1"/>
           <w:sz w:val="21"/>
         </w:rPr>
-        <w:t xml:space="preserve">  </w:t>
-      </w:r>
-      <w:proofErr w:type="spellStart"/>
+        <w:t xml:space="preserve">  Elimination test banner (action='maneuver</w:t>
+      </w:r>
+      <w:proofErr w:type="gramStart"/>
       <w:r>
         <w:rPr>
           <w:color w:val="000000" w:themeColor="text1"/>
           <w:sz w:val="21"/>
         </w:rPr>
-        <w:t>Gunicorn</w:t>
-      </w:r>
-      <w:proofErr w:type="spellEnd"/>
+        <w:t>') —</w:t>
+      </w:r>
+      <w:proofErr w:type="gramEnd"/>
       <w:r>
         <w:rPr>
           <w:color w:val="000000" w:themeColor="text1"/>
           <w:sz w:val="21"/>
         </w:rPr>
-        <w:t xml:space="preserve"> with </w:t>
-      </w:r>
-      <w:proofErr w:type="spellStart"/>
+        <w:t xml:space="preserve"> visible yellow overlay gives clear clinical </w:t>
+      </w:r>
+      <w:proofErr w:type="gramStart"/>
       <w:r>
         <w:rPr>
           <w:color w:val="000000" w:themeColor="text1"/>
           <w:sz w:val="21"/>
         </w:rPr>
-        <w:t>worker_class</w:t>
-      </w:r>
-      <w:proofErr w:type="spellEnd"/>
+        <w:t>cue</w:t>
+      </w:r>
+      <w:proofErr w:type="gramEnd"/>
       <w:r>
         <w:rPr>
           <w:color w:val="000000" w:themeColor="text1"/>
           <w:sz w:val="21"/>
         </w:rPr>
-        <w:t>='</w:t>
-      </w:r>
-      <w:proofErr w:type="spellStart"/>
-      <w:r>
-        <w:rPr>
-          <w:color w:val="000000" w:themeColor="text1"/>
-          <w:sz w:val="21"/>
-        </w:rPr>
-        <w:t>gthread</w:t>
-      </w:r>
-      <w:proofErr w:type="spellEnd"/>
-      <w:r>
-        <w:rPr>
-          <w:color w:val="000000" w:themeColor="text1"/>
-          <w:sz w:val="21"/>
-        </w:rPr>
-        <w:t xml:space="preserve">' and threads=4 — the only </w:t>
-      </w:r>
-      <w:proofErr w:type="spellStart"/>
-      <w:r>
-        <w:rPr>
-          <w:color w:val="000000" w:themeColor="text1"/>
-          <w:sz w:val="21"/>
-        </w:rPr>
-        <w:t>Gunicorn</w:t>
-      </w:r>
-      <w:proofErr w:type="spellEnd"/>
-      <w:r>
-        <w:rPr>
-          <w:color w:val="000000" w:themeColor="text1"/>
-          <w:sz w:val="21"/>
-        </w:rPr>
-        <w:t xml:space="preserve"> configuration that works with Flask-</w:t>
-      </w:r>
-      <w:proofErr w:type="spellStart"/>
-      <w:r>
-        <w:rPr>
-          <w:color w:val="000000" w:themeColor="text1"/>
-          <w:sz w:val="21"/>
-        </w:rPr>
-        <w:t>SocketIO</w:t>
-      </w:r>
-      <w:proofErr w:type="spellEnd"/>
-      <w:r>
-        <w:rPr>
-          <w:color w:val="000000" w:themeColor="text1"/>
-          <w:sz w:val="21"/>
-        </w:rPr>
-        <w:t xml:space="preserve"> threading mode; sync and </w:t>
-      </w:r>
-      <w:proofErr w:type="spellStart"/>
-      <w:r>
-        <w:rPr>
-          <w:color w:val="000000" w:themeColor="text1"/>
-          <w:sz w:val="21"/>
-        </w:rPr>
-        <w:t>gevent</w:t>
-      </w:r>
-      <w:proofErr w:type="spellEnd"/>
-      <w:r>
-        <w:rPr>
-          <w:color w:val="000000" w:themeColor="text1"/>
-          <w:sz w:val="21"/>
-        </w:rPr>
-        <w:t xml:space="preserve"> workers both failed.</w:t>
-      </w:r>
-    </w:p>
-    <w:p>
-      <w:pPr>
-        <w:pStyle w:val="ListBullet"/>
-        <w:spacing w:after="40"/>
-        <w:ind w:left="432"/>
-        <w:rPr>
-          <w:color w:val="000000" w:themeColor="text1"/>
-        </w:rPr>
-      </w:pPr>
-      <w:r>
-        <w:rPr>
-          <w:color w:val="000000" w:themeColor="text1"/>
-          <w:sz w:val="21"/>
-        </w:rPr>
-        <w:t xml:space="preserve">  Unix socket for </w:t>
-      </w:r>
-      <w:proofErr w:type="spellStart"/>
-      <w:r>
-        <w:rPr>
-          <w:color w:val="000000" w:themeColor="text1"/>
-          <w:sz w:val="21"/>
-        </w:rPr>
-        <w:t>Gunicorn↔Nginx</w:t>
-      </w:r>
-      <w:proofErr w:type="spellEnd"/>
-      <w:r>
-        <w:rPr>
-          <w:color w:val="000000" w:themeColor="text1"/>
-          <w:sz w:val="21"/>
-        </w:rPr>
-        <w:t xml:space="preserve"> IPC (task2.sock) — lower latency than TCP </w:t>
-      </w:r>
-      <w:proofErr w:type="spellStart"/>
+        <w:t xml:space="preserve"> during the elimination test step.</w:t>
+      </w:r>
+    </w:p>
+    <w:p>
+      <w:pPr>
+        <w:spacing w:before="200" w:after="60"/>
+      </w:pPr>
       <w:proofErr w:type="gramStart"/>
       <w:r>
-        <w:rPr>
-          <w:color w:val="000000" w:themeColor="text1"/>
-          <w:sz w:val="21"/>
-        </w:rPr>
-        <w:t>localhost:port</w:t>
-      </w:r>
-      <w:proofErr w:type="spellEnd"/>
-      <w:proofErr w:type="gramEnd"/>
-      <w:r>
-        <w:rPr>
-          <w:color w:val="000000" w:themeColor="text1"/>
-          <w:sz w:val="21"/>
-        </w:rPr>
-        <w:t xml:space="preserve"> and avoids port conflicts when multiple apps run on the same server.</w:t>
-      </w:r>
-    </w:p>
-    <w:p>
-      <w:pPr>
-        <w:pStyle w:val="ListBullet"/>
-        <w:spacing w:after="40"/>
-        <w:ind w:left="432"/>
-        <w:rPr>
-          <w:color w:val="000000" w:themeColor="text1"/>
-        </w:rPr>
-      </w:pPr>
-      <w:r>
-        <w:rPr>
-          <w:color w:val="000000" w:themeColor="text1"/>
-          <w:sz w:val="21"/>
-        </w:rPr>
-        <w:t xml:space="preserve">  Nginx WebSocket proxy with Upgrade + Connection headers — without these two headers the WebSocket handshake fails silently; adding them resolved all WebSocket connectivity issues.</w:t>
-      </w:r>
-    </w:p>
-    <w:p>
-      <w:pPr>
-        <w:pStyle w:val="ListBullet"/>
-        <w:spacing w:after="40"/>
-        <w:ind w:left="432"/>
-        <w:rPr>
-          <w:color w:val="000000" w:themeColor="text1"/>
-        </w:rPr>
-      </w:pPr>
-      <w:r>
-        <w:rPr>
-          <w:color w:val="000000" w:themeColor="text1"/>
-          <w:sz w:val="21"/>
-        </w:rPr>
-        <w:t xml:space="preserve">  Port 8080 for Task-2 alongside Task-1 on port 80 — two independent </w:t>
-      </w:r>
-      <w:proofErr w:type="spellStart"/>
-      <w:r>
-        <w:rPr>
-          <w:color w:val="000000" w:themeColor="text1"/>
-          <w:sz w:val="21"/>
-        </w:rPr>
-        <w:t>systemd</w:t>
-      </w:r>
-      <w:proofErr w:type="spellEnd"/>
-      <w:r>
-        <w:rPr>
-          <w:color w:val="000000" w:themeColor="text1"/>
-          <w:sz w:val="21"/>
-        </w:rPr>
-        <w:t xml:space="preserve"> services (task1 and task2), two Unix sockets, two Nginx server blocks coexist cleanly with no interference.</w:t>
-      </w:r>
-    </w:p>
-    <w:p>
-      <w:pPr>
-        <w:pStyle w:val="ListBullet"/>
-        <w:spacing w:after="40"/>
-        <w:ind w:left="432"/>
-        <w:rPr>
-          <w:color w:val="000000" w:themeColor="text1"/>
-        </w:rPr>
-      </w:pPr>
-      <w:r>
-        <w:rPr>
-          <w:color w:val="000000" w:themeColor="text1"/>
-          <w:sz w:val="21"/>
-        </w:rPr>
-        <w:t xml:space="preserve">  GitHub Actions SSH deploy (</w:t>
-      </w:r>
-      <w:proofErr w:type="gramStart"/>
-      <w:r>
-        <w:rPr>
-          <w:color w:val="000000" w:themeColor="text1"/>
-          <w:sz w:val="21"/>
-        </w:rPr>
-        <w:t>.</w:t>
-      </w:r>
-      <w:proofErr w:type="spellStart"/>
-      <w:r>
-        <w:rPr>
-          <w:color w:val="000000" w:themeColor="text1"/>
-          <w:sz w:val="21"/>
-        </w:rPr>
-        <w:t>github</w:t>
-      </w:r>
-      <w:proofErr w:type="spellEnd"/>
-      <w:r>
-        <w:rPr>
-          <w:color w:val="000000" w:themeColor="text1"/>
-          <w:sz w:val="21"/>
-        </w:rPr>
-        <w:t>/workflows/</w:t>
-      </w:r>
-      <w:proofErr w:type="spellStart"/>
-      <w:r>
-        <w:rPr>
-          <w:color w:val="000000" w:themeColor="text1"/>
-          <w:sz w:val="21"/>
-        </w:rPr>
-        <w:t>deploy.yml</w:t>
-      </w:r>
-      <w:proofErr w:type="spellEnd"/>
-      <w:r>
-        <w:rPr>
-          <w:color w:val="000000" w:themeColor="text1"/>
-          <w:sz w:val="21"/>
-        </w:rPr>
-        <w:t>) —</w:t>
-      </w:r>
-      <w:proofErr w:type="gramEnd"/>
-      <w:r>
-        <w:rPr>
-          <w:color w:val="000000" w:themeColor="text1"/>
-          <w:sz w:val="21"/>
-        </w:rPr>
-        <w:t xml:space="preserve"> push-to-deploy pipeline works reliably; the update.sh script is </w:t>
-      </w:r>
-      <w:proofErr w:type="gramStart"/>
-      <w:r>
-        <w:rPr>
-          <w:color w:val="000000" w:themeColor="text1"/>
-          <w:sz w:val="21"/>
-        </w:rPr>
-        <w:t>idempotent</w:t>
-      </w:r>
-      <w:proofErr w:type="gramEnd"/>
-      <w:r>
-        <w:rPr>
-          <w:color w:val="000000" w:themeColor="text1"/>
-          <w:sz w:val="21"/>
-        </w:rPr>
-        <w:t xml:space="preserve"> so repeated pushes do not break anything.</w:t>
-      </w:r>
-    </w:p>
-    <w:p>
-      <w:pPr>
-        <w:pStyle w:val="ListBullet"/>
-        <w:spacing w:after="40"/>
-        <w:ind w:left="432"/>
-        <w:rPr>
-          <w:color w:val="000000" w:themeColor="text1"/>
-        </w:rPr>
-      </w:pPr>
-      <w:r>
-        <w:rPr>
-          <w:color w:val="000000" w:themeColor="text1"/>
-          <w:sz w:val="21"/>
-        </w:rPr>
-        <w:t xml:space="preserve"> libgl</w:t>
-      </w:r>
-      <w:r>
-        <w:rPr>
-          <w:color w:val="000000" w:themeColor="text1"/>
-          <w:sz w:val="21"/>
-        </w:rPr>
-        <w:t xml:space="preserve">1 system package (apt-get install -y </w:t>
-      </w:r>
-      <w:proofErr w:type="gramStart"/>
-      <w:r>
-        <w:rPr>
-          <w:color w:val="000000" w:themeColor="text1"/>
-          <w:sz w:val="21"/>
-        </w:rPr>
-        <w:t>libgl1) —</w:t>
-      </w:r>
-      <w:proofErr w:type="gramEnd"/>
-      <w:r>
-        <w:rPr>
-          <w:color w:val="000000" w:themeColor="text1"/>
-          <w:sz w:val="21"/>
-        </w:rPr>
-        <w:t xml:space="preserve"> once installed, OpenCV imports without error on headless Ubuntu; the fix persists across reboots and service restarts.</w:t>
-      </w:r>
-    </w:p>
-    <w:p>
-      <w:pPr>
-        <w:pStyle w:val="ListBullet"/>
-        <w:spacing w:after="40"/>
-        <w:ind w:left="432"/>
-        <w:rPr>
-          <w:color w:val="000000" w:themeColor="text1"/>
-        </w:rPr>
-      </w:pPr>
-      <w:r>
-        <w:rPr>
-          <w:color w:val="000000" w:themeColor="text1"/>
-          <w:sz w:val="21"/>
-        </w:rPr>
-        <w:t xml:space="preserve">  </w:t>
-      </w:r>
-      <w:proofErr w:type="spellStart"/>
-      <w:r>
-        <w:rPr>
-          <w:color w:val="000000" w:themeColor="text1"/>
-          <w:sz w:val="21"/>
-        </w:rPr>
-        <w:t>opencv</w:t>
-      </w:r>
-      <w:proofErr w:type="spellEnd"/>
-      <w:r>
-        <w:rPr>
-          <w:color w:val="000000" w:themeColor="text1"/>
-          <w:sz w:val="21"/>
-        </w:rPr>
-        <w:t>-python-headless in requirements.txt — the headless variant avoids pulling in GTK/Qt display libraries that are meaningless on a server and would cause import errors.</w:t>
-      </w:r>
-    </w:p>
-    <w:p>
-      <w:pPr>
-        <w:spacing w:before="200" w:after="60"/>
         <w:rPr>
           <w:b/>
           <w:color w:val="1F7A8C"/>
           <w:sz w:val="26"/>
         </w:rPr>
-      </w:pPr>
-    </w:p>
-    <w:p>
-      <w:pPr>
-        <w:spacing w:before="200" w:after="60"/>
-        <w:rPr>
-          <w:b/>
-          <w:color w:val="1F7A8C"/>
-          <w:sz w:val="26"/>
-        </w:rPr>
-      </w:pPr>
-    </w:p>
-    <w:p>
-      <w:pPr>
-        <w:spacing w:before="200" w:after="60"/>
-      </w:pPr>
-      <w:proofErr w:type="gramStart"/>
-      <w:r>
-        <w:rPr>
-          <w:b/>
-          <w:color w:val="1F7A8C"/>
-          <w:sz w:val="26"/>
-        </w:rPr>
-        <w:lastRenderedPageBreak/>
-        <w:t>17</w:t>
-      </w:r>
-      <w:r>
-        <w:rPr>
-          <w:b/>
-          <w:color w:val="1F7A8C"/>
-          <w:sz w:val="26"/>
-        </w:rPr>
-        <w:t>.3  Frontend</w:t>
-      </w:r>
-      <w:proofErr w:type="gramEnd"/>
-    </w:p>
-    <w:p>
-      <w:pPr>
-        <w:pStyle w:val="ListBullet"/>
-        <w:spacing w:after="40"/>
-        <w:ind w:left="432"/>
-        <w:rPr>
-          <w:color w:val="000000" w:themeColor="text1"/>
-        </w:rPr>
-      </w:pPr>
-      <w:r>
-        <w:rPr>
-          <w:color w:val="000000" w:themeColor="text1"/>
-          <w:sz w:val="21"/>
-        </w:rPr>
-        <w:t xml:space="preserve">  Collapsible thinking </w:t>
-      </w:r>
-      <w:proofErr w:type="gramStart"/>
-      <w:r>
-        <w:rPr>
-          <w:color w:val="000000" w:themeColor="text1"/>
-          <w:sz w:val="21"/>
-        </w:rPr>
-        <w:t>log —</w:t>
-      </w:r>
-      <w:proofErr w:type="gramEnd"/>
-      <w:r>
-        <w:rPr>
-          <w:color w:val="000000" w:themeColor="text1"/>
-          <w:sz w:val="21"/>
-        </w:rPr>
-        <w:t xml:space="preserve"> the per-turn expandable entries (</w:t>
-      </w:r>
-      <w:proofErr w:type="spellStart"/>
-      <w:r>
-        <w:rPr>
-          <w:color w:val="000000" w:themeColor="text1"/>
-          <w:sz w:val="21"/>
-        </w:rPr>
-        <w:t>posY</w:t>
-      </w:r>
-      <w:proofErr w:type="spellEnd"/>
-      <w:r>
-        <w:rPr>
-          <w:color w:val="000000" w:themeColor="text1"/>
-          <w:sz w:val="21"/>
-        </w:rPr>
-        <w:t xml:space="preserve">, region, raw state message, raw LLM response) are essential for debugging crew </w:t>
-      </w:r>
-      <w:proofErr w:type="spellStart"/>
-      <w:r>
-        <w:rPr>
-          <w:color w:val="000000" w:themeColor="text1"/>
-          <w:sz w:val="21"/>
-        </w:rPr>
-        <w:t>behaviour</w:t>
-      </w:r>
-      <w:proofErr w:type="spellEnd"/>
-      <w:r>
-        <w:rPr>
-          <w:color w:val="000000" w:themeColor="text1"/>
-          <w:sz w:val="21"/>
-        </w:rPr>
-        <w:t xml:space="preserve"> without cluttering the UI.</w:t>
-      </w:r>
-    </w:p>
-    <w:p>
-      <w:pPr>
-        <w:pStyle w:val="ListBullet"/>
-        <w:spacing w:after="40"/>
-        <w:ind w:left="432"/>
-        <w:rPr>
-          <w:color w:val="000000" w:themeColor="text1"/>
-        </w:rPr>
-      </w:pPr>
-      <w:r>
-        <w:rPr>
-          <w:color w:val="000000" w:themeColor="text1"/>
-          <w:sz w:val="21"/>
-        </w:rPr>
-        <w:t xml:space="preserve">  Elimination test banner (action='maneuver</w:t>
-      </w:r>
-      <w:proofErr w:type="gramStart"/>
-      <w:r>
-        <w:rPr>
-          <w:color w:val="000000" w:themeColor="text1"/>
-          <w:sz w:val="21"/>
-        </w:rPr>
-        <w:t>') —</w:t>
-      </w:r>
-      <w:proofErr w:type="gramEnd"/>
-      <w:r>
-        <w:rPr>
-          <w:color w:val="000000" w:themeColor="text1"/>
-          <w:sz w:val="21"/>
-        </w:rPr>
-        <w:t xml:space="preserve"> visible yellow overlay gives clear clinical </w:t>
-      </w:r>
-      <w:proofErr w:type="gramStart"/>
-      <w:r>
-        <w:rPr>
-          <w:color w:val="000000" w:themeColor="text1"/>
-          <w:sz w:val="21"/>
-        </w:rPr>
-        <w:t>cue</w:t>
-      </w:r>
-      <w:proofErr w:type="gramEnd"/>
-      <w:r>
-        <w:rPr>
-          <w:color w:val="000000" w:themeColor="text1"/>
-          <w:sz w:val="21"/>
-        </w:rPr>
-        <w:t xml:space="preserve"> during the elimination test step.</w:t>
-      </w:r>
-    </w:p>
-    <w:p>
-      <w:pPr>
-        <w:spacing w:before="200" w:after="60"/>
-      </w:pPr>
-      <w:proofErr w:type="gramStart"/>
-      <w:r>
-        <w:rPr>
-          <w:b/>
-          <w:color w:val="1F7A8C"/>
-          <w:sz w:val="26"/>
-        </w:rPr>
-        <w:t>17</w:t>
-      </w:r>
-      <w:r>
-        <w:rPr>
-          <w:b/>
-          <w:color w:val="1F7A8C"/>
-          <w:sz w:val="26"/>
-        </w:rPr>
-        <w:t>.4  Clinical</w:t>
+        <w:t>17.4  Clinical</w:t>
       </w:r>
       <w:proofErr w:type="gramEnd"/>
       <w:r>
@@ -13261,7 +13375,13 @@
           <w:color w:val="8B0000"/>
           <w:sz w:val="21"/>
         </w:rPr>
-        <w:t xml:space="preserve">  Confused shunt type rules when multiple clip types were present</w:t>
+        <w:t xml:space="preserve">  </w:t>
+      </w:r>
+      <w:r>
+        <w:rPr>
+          <w:sz w:val="21"/>
+        </w:rPr>
+        <w:t>Confused shunt type rules when multiple clip types were present</w:t>
       </w:r>
     </w:p>
     <w:p>
@@ -13272,7 +13392,6 @@
       </w:pPr>
       <w:r>
         <w:rPr>
-          <w:color w:val="8B0000"/>
           <w:sz w:val="21"/>
         </w:rPr>
         <w:t xml:space="preserve">  Missed elimination test logic (Type 3 vs Type 1+2 disambiguation)</w:t>
@@ -13286,7 +13405,6 @@
       </w:pPr>
       <w:r>
         <w:rPr>
-          <w:color w:val="8B0000"/>
           <w:sz w:val="21"/>
         </w:rPr>
         <w:t xml:space="preserve">  Produced inconsistent JSON when the reasoning was complex</w:t>
@@ -14200,6 +14318,743 @@
         <w:br w:type="page"/>
       </w:r>
     </w:p>
+    <w:p>
+      <w:pPr>
+        <w:pStyle w:val="Heading2"/>
+      </w:pPr>
+      <w:r>
+        <w:lastRenderedPageBreak/>
+        <w:t>3.3  Agentic System Architecture Diagram</w:t>
+      </w:r>
+    </w:p>
+    <w:p>
+      <w:r>
+        <w:t>The diagram below shows the complete request-to-response pipeline for a single probe_move or clip_mark event. The five-layer structure (Surgeon → Server → Engine → Agents → UI) illustrates how each component contributes to the final guidance output and how the two parallel branches (VLM analysis and context building) converge at the CrewAI crew kickoff.</w:t>
+      </w:r>
+    </w:p>
+    <w:p>
+      <w:pPr>
+        <w:jc w:val="center"/>
+      </w:pPr>
+      <w:r>
+        <w:rPr>
+          <w:noProof/>
+        </w:rPr>
+        <w:drawing>
+          <wp:inline distT="0" distB="0" distL="0" distR="0" wp14:anchorId="56303A09" wp14:editId="36BABBDF">
+            <wp:extent cx="5792470" cy="6615430"/>
+            <wp:effectExtent l="0" t="0" r="0" b="0"/>
+            <wp:docPr id="1650574105" name="Picture 2"/>
+            <wp:cNvGraphicFramePr>
+              <a:graphicFrameLocks xmlns:a="http://schemas.openxmlformats.org/drawingml/2006/main" noChangeAspect="1"/>
+            </wp:cNvGraphicFramePr>
+            <a:graphic xmlns:a="http://schemas.openxmlformats.org/drawingml/2006/main">
+              <a:graphicData uri="http://schemas.openxmlformats.org/drawingml/2006/picture">
+                <pic:pic xmlns:pic="http://schemas.openxmlformats.org/drawingml/2006/picture">
+                  <pic:nvPicPr>
+                    <pic:cNvPr id="1650574105" name="Picture 1650574105"/>
+                    <pic:cNvPicPr/>
+                  </pic:nvPicPr>
+                  <pic:blipFill>
+                    <a:blip r:embed="rId6"/>
+                    <a:stretch>
+                      <a:fillRect/>
+                    </a:stretch>
+                  </pic:blipFill>
+                  <pic:spPr>
+                    <a:xfrm>
+                      <a:off x="0" y="0"/>
+                      <a:ext cx="5792470" cy="6615430"/>
+                    </a:xfrm>
+                    <a:prstGeom prst="rect">
+                      <a:avLst/>
+                    </a:prstGeom>
+                  </pic:spPr>
+                </pic:pic>
+              </a:graphicData>
+            </a:graphic>
+          </wp:inline>
+        </w:drawing>
+      </w:r>
+    </w:p>
+    <w:p>
+      <w:r>
+        <w:t>Figure 1: Full agentic system architecture for Task 2 real-time guidance. Colour coding: blue = Flask/SocketIO server components; amber = VLM (Groq Vision); green = pure-Python pre-</w:t>
+      </w:r>
+      <w:r>
+        <w:lastRenderedPageBreak/>
+        <w:t>agents; purple = CrewAI agents; red = WebSocket output events. Model tier labels show which Groq model handles each agent.</w:t>
+      </w:r>
+    </w:p>
+    <w:p>
+      <w:r>
+        <w:rPr>
+          <w:noProof/>
+        </w:rPr>
+        <w:drawing>
+          <wp:inline distT="0" distB="0" distL="0" distR="0" wp14:anchorId="11E0B8B8" wp14:editId="6F1EBA6B">
+            <wp:extent cx="5792293" cy="7176212"/>
+            <wp:effectExtent l="0" t="0" r="0" b="5715"/>
+            <wp:docPr id="1477486203" name="Picture 5"/>
+            <wp:cNvGraphicFramePr>
+              <a:graphicFrameLocks xmlns:a="http://schemas.openxmlformats.org/drawingml/2006/main" noChangeAspect="1"/>
+            </wp:cNvGraphicFramePr>
+            <a:graphic xmlns:a="http://schemas.openxmlformats.org/drawingml/2006/main">
+              <a:graphicData uri="http://schemas.openxmlformats.org/drawingml/2006/picture">
+                <pic:pic xmlns:pic="http://schemas.openxmlformats.org/drawingml/2006/picture">
+                  <pic:nvPicPr>
+                    <pic:cNvPr id="1477486203" name="Picture 1477486203"/>
+                    <pic:cNvPicPr/>
+                  </pic:nvPicPr>
+                  <pic:blipFill>
+                    <a:blip r:embed="rId7"/>
+                    <a:stretch>
+                      <a:fillRect/>
+                    </a:stretch>
+                  </pic:blipFill>
+                  <pic:spPr>
+                    <a:xfrm>
+                      <a:off x="0" y="0"/>
+                      <a:ext cx="5794207" cy="7178583"/>
+                    </a:xfrm>
+                    <a:prstGeom prst="rect">
+                      <a:avLst/>
+                    </a:prstGeom>
+                  </pic:spPr>
+                </pic:pic>
+              </a:graphicData>
+            </a:graphic>
+          </wp:inline>
+        </w:drawing>
+      </w:r>
+    </w:p>
+    <w:p>
+      <w:r>
+        <w:rPr>
+          <w:noProof/>
+        </w:rPr>
+        <w:t>Figure 2 : Agentic System Architecture Diagram describing the flow of context and data from one agent to another.</w:t>
+      </w:r>
+    </w:p>
+    <w:p>
+      <w:pPr>
+        <w:pStyle w:val="Heading2"/>
+      </w:pPr>
+      <w:proofErr w:type="gramStart"/>
+      <w:r>
+        <w:lastRenderedPageBreak/>
+        <w:t>8.6  Three</w:t>
+      </w:r>
+      <w:proofErr w:type="gramEnd"/>
+      <w:r>
+        <w:t>-Tier Model Assignment Strategy</w:t>
+      </w:r>
+    </w:p>
+    <w:p>
+      <w:r>
+        <w:t>All five CrewAI agents call the Groq API, but not at the same model size. Three model tiers are defined in config.py and assigned per agent:</w:t>
+      </w:r>
+    </w:p>
+    <w:tbl>
+      <w:tblPr>
+        <w:tblStyle w:val="TableGrid"/>
+        <w:tblW w:w="0" w:type="auto"/>
+        <w:tblLook w:val="04A0" w:firstRow="1" w:lastRow="0" w:firstColumn="1" w:lastColumn="0" w:noHBand="0" w:noVBand="1"/>
+      </w:tblPr>
+      <w:tblGrid>
+        <w:gridCol w:w="2280"/>
+        <w:gridCol w:w="2280"/>
+        <w:gridCol w:w="2280"/>
+        <w:gridCol w:w="2280"/>
+      </w:tblGrid>
+      <w:tr>
+        <w:tc>
+          <w:tcPr>
+            <w:tcW w:w="2280" w:type="dxa"/>
+          </w:tcPr>
+          <w:p>
+            <w:r>
+              <w:rPr>
+                <w:b/>
+              </w:rPr>
+              <w:t>Tier</w:t>
+            </w:r>
+          </w:p>
+        </w:tc>
+        <w:tc>
+          <w:tcPr>
+            <w:tcW w:w="2280" w:type="dxa"/>
+          </w:tcPr>
+          <w:p>
+            <w:r>
+              <w:rPr>
+                <w:b/>
+              </w:rPr>
+              <w:t>Groq Model</w:t>
+            </w:r>
+          </w:p>
+        </w:tc>
+        <w:tc>
+          <w:tcPr>
+            <w:tcW w:w="2280" w:type="dxa"/>
+          </w:tcPr>
+          <w:p>
+            <w:r>
+              <w:rPr>
+                <w:b/>
+              </w:rPr>
+              <w:t>Assigned Agents</w:t>
+            </w:r>
+          </w:p>
+        </w:tc>
+        <w:tc>
+          <w:tcPr>
+            <w:tcW w:w="2280" w:type="dxa"/>
+          </w:tcPr>
+          <w:p>
+            <w:r>
+              <w:rPr>
+                <w:b/>
+              </w:rPr>
+              <w:t>Rationale</w:t>
+            </w:r>
+          </w:p>
+        </w:tc>
+      </w:tr>
+      <w:tr>
+        <w:tc>
+          <w:tcPr>
+            <w:tcW w:w="2280" w:type="dxa"/>
+          </w:tcPr>
+          <w:p>
+            <w:r>
+              <w:t>Heavy</w:t>
+            </w:r>
+          </w:p>
+        </w:tc>
+        <w:tc>
+          <w:tcPr>
+            <w:tcW w:w="2280" w:type="dxa"/>
+          </w:tcPr>
+          <w:p>
+            <w:r>
+              <w:t>openai/gpt-oss-120b</w:t>
+            </w:r>
+          </w:p>
+        </w:tc>
+        <w:tc>
+          <w:tcPr>
+            <w:tcW w:w="2280" w:type="dxa"/>
+          </w:tcPr>
+          <w:p>
+            <w:r>
+              <w:t>Shunt Analyst, Circuit Analyst, Guidance Specialist</w:t>
+            </w:r>
+          </w:p>
+        </w:tc>
+        <w:tc>
+          <w:tcPr>
+            <w:tcW w:w="2280" w:type="dxa"/>
+          </w:tcPr>
+          <w:p>
+            <w:r>
+              <w:t>Tasks requiring strict rule application (shunt classification), complex spatial reasoning (examination states A–F), or exact JSON parsing from multi-agent context.</w:t>
+            </w:r>
+          </w:p>
+        </w:tc>
+      </w:tr>
+      <w:tr>
+        <w:tc>
+          <w:tcPr>
+            <w:tcW w:w="2280" w:type="dxa"/>
+          </w:tcPr>
+          <w:p>
+            <w:r>
+              <w:t>Mid</w:t>
+            </w:r>
+          </w:p>
+        </w:tc>
+        <w:tc>
+          <w:tcPr>
+            <w:tcW w:w="2280" w:type="dxa"/>
+          </w:tcPr>
+          <w:p>
+            <w:r>
+              <w:t>llama-3.3-70b-versatile</w:t>
+            </w:r>
+          </w:p>
+        </w:tc>
+        <w:tc>
+          <w:tcPr>
+            <w:tcW w:w="2280" w:type="dxa"/>
+          </w:tcPr>
+          <w:p>
+            <w:r>
+              <w:t>Clinical Interpreter, Navigation Planner</w:t>
+            </w:r>
+          </w:p>
+        </w:tc>
+        <w:tc>
+          <w:tcPr>
+            <w:tcW w:w="2280" w:type="dxa"/>
+          </w:tcPr>
+          <w:p>
+            <w:r>
+              <w:t>Synthesis and movement-command generation — lower stakes reasoning that benefits from speed without sacrificing accuracy.</w:t>
+            </w:r>
+          </w:p>
+        </w:tc>
+      </w:tr>
+      <w:tr>
+        <w:tc>
+          <w:tcPr>
+            <w:tcW w:w="2280" w:type="dxa"/>
+          </w:tcPr>
+          <w:p>
+            <w:r>
+              <w:t>Fast</w:t>
+            </w:r>
+          </w:p>
+        </w:tc>
+        <w:tc>
+          <w:tcPr>
+            <w:tcW w:w="2280" w:type="dxa"/>
+          </w:tcPr>
+          <w:p>
+            <w:r>
+              <w:t>llama-3.1-8b-instant</w:t>
+            </w:r>
+          </w:p>
+        </w:tc>
+        <w:tc>
+          <w:tcPr>
+            <w:tcW w:w="2280" w:type="dxa"/>
+          </w:tcPr>
+          <w:p>
+            <w:r>
+              <w:t>(reserved — not active in current agents)</w:t>
+            </w:r>
+          </w:p>
+        </w:tc>
+        <w:tc>
+          <w:tcPr>
+            <w:tcW w:w="2280" w:type="dxa"/>
+          </w:tcPr>
+          <w:p>
+            <w:r>
+              <w:t>Lightweight JSON formatting; available for future use where speed is the primary constraint.</w:t>
+            </w:r>
+          </w:p>
+        </w:tc>
+      </w:tr>
+    </w:tbl>
+    <w:p/>
+    <w:p>
+      <w:r>
+        <w:t>All agents share temperature=0.3, allow_delegation=False, and max_iter=3. Temperature 0.3 was chosen after testing: 0.0 caused occasional frozen outputs for the same position; 0.7 produced variable phrasing that was clinically imprecise. 0.3 balances determinism and vocabulary variety.</w:t>
+      </w:r>
+    </w:p>
+    <w:p>
+      <w:pPr>
+        <w:pStyle w:val="Heading2"/>
+      </w:pPr>
+      <w:r>
+        <w:t>8.7  Circuit Analyst Examination States A–F  (full reference)</w:t>
+      </w:r>
+    </w:p>
+    <w:p>
+      <w:r>
+        <w:t>In the current version, Agent 3 (Circuit Analyst) outputs a formal Examination State label (A–F) as the first token of its response. The Navigation Planner reads this label and issues the appropriate movement command for each state. This replaces the earlier free-text 'target zone' approach with a structured, verifiable state machine.</w:t>
+      </w:r>
+    </w:p>
+    <w:p>
+      <w:pPr>
+        <w:pStyle w:val="Heading3"/>
+      </w:pPr>
+      <w:r>
+        <w:t>State A: Q1 OPEN — no entry point found yet</w:t>
+      </w:r>
+    </w:p>
+    <w:p>
+      <w:r>
+        <w:t>Routing logic: If probe posY 0.04–0.57 (Q1 corridor): examine current zone anatomy (GSV in fascial compartment, Hunterian perforator, SFJ junction, etc.). NEVER route to another zone while inside the corridor — Q1 has not been confirmed and the probe must examine HERE first. If probe posY &gt; 0.57: route to the nearest unvisited Q1 candidate zone (SFJ/groin → Hunterian → popliteal/SPJ). Zone anti-repetition applies — zones suggested ≥2 times in recent guidance are avoided (see §8.8).</w:t>
+      </w:r>
+    </w:p>
+    <w:p>
+      <w:r>
+        <w:lastRenderedPageBreak/>
+        <w:t>Example output: Navigation Planner output: 'Move medially toward GSV in saphenous compartment at upper thigh'</w:t>
+      </w:r>
+    </w:p>
+    <w:p>
+      <w:pPr>
+        <w:pStyle w:val="Heading3"/>
+      </w:pPr>
+      <w:r>
+        <w:t>State B: Q1 confirmed, Q2 open — entry found; trace trunk reflux</w:t>
+      </w:r>
+    </w:p>
+    <w:p>
+      <w:r>
+        <w:t>Routing logic: Probe traces distally along anteromedial thigh to confirm RP N2→N1 (GSV trunk refluxing downward). From SFJ, move to upper thigh; from upper thigh, continue to Hunterian/Dodd zone. Do NOT jump to calf or SPJ in State B.</w:t>
+      </w:r>
+    </w:p>
+    <w:p>
+      <w:r>
+        <w:t>Example output: Navigation Planner output: 'Move distally toward Dodd perforator on medial distal thigh'</w:t>
+      </w:r>
+    </w:p>
+    <w:p>
+      <w:pPr>
+        <w:pStyle w:val="Heading3"/>
+      </w:pPr>
+      <w:r>
+        <w:t>State C: Q1+Q2 confirmed, Q3 open — find tributary escape point EP N2→N3</w:t>
+      </w:r>
+    </w:p>
+    <w:p>
+      <w:r>
+        <w:t>Routing logic: Probe scans the medial calf (posY 0.60–0.75) for where the GSV trunk gives off a tributary above the fascia. If probe is in the thigh, route to the upper medial calf first. Do NOT route to SPJ or back to thigh — the escape is in the calf. The target is the GSV trunk giving off a tributary (N3), NOT the re-entry perforator (which is State D territory).</w:t>
+      </w:r>
+    </w:p>
+    <w:p>
+      <w:r>
+        <w:t>Example output: Navigation Planner output: 'Move distally toward GSV in medial calf'</w:t>
+      </w:r>
+    </w:p>
+    <w:p>
+      <w:pPr>
+        <w:pStyle w:val="Heading3"/>
+      </w:pPr>
+      <w:r>
+        <w:t>State D: Q3 confirmed, Q4 open — track tributary to re-entry RP N3→N1</w:t>
+      </w:r>
+    </w:p>
+    <w:p>
+      <w:r>
+        <w:t>Routing logic: Follow the N3 tributary toward the lower calf (posY 0.75–0.88) to find where it dives back into the deep system. If probe posY &lt; 0.75, move distally. If already in lower calf, examine the medial lower-calf perforator — do NOT continue to ankle. Re-entry is in the lower calf.</w:t>
+      </w:r>
+    </w:p>
+    <w:p>
+      <w:r>
+        <w:t>Example output: Navigation Planner output: 'Move distally toward re-entry perforator on medial lower calf'</w:t>
+      </w:r>
+    </w:p>
+    <w:p>
+      <w:pPr>
+        <w:pStyle w:val="Heading3"/>
+      </w:pPr>
+      <w:r>
+        <w:t>State E: Q1–Q4 confirmed</w:t>
+      </w:r>
+    </w:p>
+    <w:p>
+      <w:r>
+        <w:t>Routing logic: E1 — elimination test not yet recorded: output only 'STATE E1. No routing — elimination test pending.' The Guidance Specialist overrides guidance to 'Perform elimination test at current zone'. E2 — elimination test IS recorded: circuit classified. Route to the most diagnostically useful unvisited zone: SPJ/popliteal fossa first (SSV circuit check), then upper thigh, then calf. Do NOT route back to SFJ/groin — the SFJ entry is already mapped.</w:t>
+      </w:r>
+    </w:p>
+    <w:p>
+      <w:r>
+        <w:t>Example output: Navigation Planner output (E1): 'Perform elimination test at current zone'  (E2): 'Move posteriorly toward SPJ junction in popliteal fossa'</w:t>
+      </w:r>
+    </w:p>
+    <w:p>
+      <w:pPr>
+        <w:pStyle w:val="Heading3"/>
+      </w:pPr>
+      <w:r>
+        <w:t>State F: EP N1→N3 found — N1-to-tributary direct bypass</w:t>
+      </w:r>
+    </w:p>
+    <w:p>
+      <w:r>
+        <w:t>Routing logic: SFJ is competent; blood enters N3 (tributary) directly from N1 (deep). Circuit Analyst traces the N3 tributary distally to find its re-entry. Type differentiation (4 / 5 / 6) depends on whether RP N2→N1, RP N3→N2 + EP N2→N3, or only RP N3→N1 is confirmed.</w:t>
+      </w:r>
+    </w:p>
+    <w:p>
+      <w:r>
+        <w:t>Example output: Navigation Planner output: 'Move distally along N3 tributary toward re-entry perforator'</w:t>
+      </w:r>
+    </w:p>
+    <w:p>
+      <w:pPr>
+        <w:pStyle w:val="Heading2"/>
+      </w:pPr>
+      <w:r>
+        <w:lastRenderedPageBreak/>
+        <w:t>8.8  Zone Anti-Repetition During Q1 Search  (State A)</w:t>
+      </w:r>
+    </w:p>
+    <w:p>
+      <w:r>
+        <w:t>During State A (Q1 open), the Circuit Analyst may suggest the same anatomical zone on consecutive guidance turns if the surgeon has not confirmed a clip. This is clinically correct (examine here before moving) but can feel repetitive if the surgeon has already thoroughly assessed that zone without finding a clip. The anti-repetition mechanism prevents excessive repetition:</w:t>
+      </w:r>
+    </w:p>
+    <w:p>
+      <w:pPr>
+        <w:pStyle w:val="ListBullet"/>
+      </w:pPr>
+      <w:r>
+        <w:t>The system tracks which anatomical zone keyword appeared in each of the last 8 guidance strings (using recent_guidance, passed to run_guidance_crew()).</w:t>
+      </w:r>
+    </w:p>
+    <w:p>
+      <w:pPr>
+        <w:pStyle w:val="ListBullet"/>
+      </w:pPr>
+      <w:r>
+        <w:t>Any zone that appears in ≥2 of the last 8 guidance outputs is marked as 'overused'. The Circuit Analyst receives the list of overused zones and is instructed to route to a DIFFERENT Q1 candidate zone.</w:t>
+      </w:r>
+    </w:p>
+    <w:p>
+      <w:pPr>
+        <w:pStyle w:val="ListBullet"/>
+      </w:pPr>
+      <w:r>
+        <w:t>Zones tracked: SFJ/groin, upper thigh, Hunterian (proximal thigh), Dodd (distal thigh), popliteal/SPJ, calf, ankle.</w:t>
+      </w:r>
+    </w:p>
+    <w:p>
+      <w:pPr>
+        <w:pStyle w:val="ListBullet"/>
+      </w:pPr>
+      <w:r>
+        <w:t>DISABLED after Q1 is confirmed: once an entry point clip (EP from N1) is in the session, the diagnostic path becomes deterministic (B→C→D→E) and the correct zone must NOT be blocked by the anti-repetition filter.</w:t>
+      </w:r>
+    </w:p>
+    <w:p>
+      <w:r>
+        <w:t>Separately, the Navigation Planner receives recent_guidance and a banned list (guidance strings that appeared ≥2 times), so it rephrases its output even when routing to the same anatomical target.</w:t>
+      </w:r>
+    </w:p>
+    <w:p>
+      <w:pPr>
+        <w:ind w:left="567"/>
+      </w:pPr>
+      <w:r>
+        <w:rPr>
+          <w:rFonts w:ascii="Courier New" w:hAnsi="Courier New"/>
+          <w:sz w:val="16"/>
+        </w:rPr>
+        <w:t># crew_pipeline.py — anti-repetition logic (State A only)</w:t>
+      </w:r>
+      <w:r>
+        <w:rPr>
+          <w:rFonts w:ascii="Courier New" w:hAnsi="Courier New"/>
+          <w:sz w:val="16"/>
+        </w:rPr>
+        <w:br/>
+        <w:t>_overused_zones = (</w:t>
+      </w:r>
+      <w:r>
+        <w:rPr>
+          <w:rFonts w:ascii="Courier New" w:hAnsi="Courier New"/>
+          <w:sz w:val="16"/>
+        </w:rPr>
+        <w:br/>
+        <w:t xml:space="preserve">    [] if _q1_answered        # disabled once entry point is confirmed</w:t>
+      </w:r>
+      <w:r>
+        <w:rPr>
+          <w:rFonts w:ascii="Courier New" w:hAnsi="Courier New"/>
+          <w:sz w:val="16"/>
+        </w:rPr>
+        <w:br/>
+        <w:t xml:space="preserve">    else [z for z, c in _zone_hits.items() if c &gt;= 2]</w:t>
+      </w:r>
+      <w:r>
+        <w:rPr>
+          <w:rFonts w:ascii="Courier New" w:hAnsi="Courier New"/>
+          <w:sz w:val="16"/>
+        </w:rPr>
+        <w:br/>
+        <w:t>)</w:t>
+      </w:r>
+    </w:p>
+    <w:p>
+      <w:pPr>
+        <w:pStyle w:val="Heading2"/>
+      </w:pPr>
+      <w:r>
+        <w:t>8.9  Multi-Shunt Scanning — Accepted Shunts Tracking</w:t>
+      </w:r>
+    </w:p>
+    <w:p>
+      <w:r>
+        <w:t>A patient may have more than one independent haemodynamic CHIVA circuit on the same leg. After the surgeon accepts the first confirmed shunt type, the session does not end — the surgeon continues scanning for additional circuits. The system handles this with an accepted_shunts set:</w:t>
+      </w:r>
+    </w:p>
+    <w:p>
+      <w:pPr>
+        <w:pStyle w:val="ListBullet"/>
+      </w:pPr>
+      <w:r>
+        <w:t>When the surgeon clicks 'Confirm' on the shunt confirmation modal, the accepted type is added to session.accepted_shunts.</w:t>
+      </w:r>
+    </w:p>
+    <w:p>
+      <w:pPr>
+        <w:pStyle w:val="ListBullet"/>
+      </w:pPr>
+      <w:r>
+        <w:t>On every subsequent crew run, the Shunt Analyst receives an accepted_ctx block listing all accepted types, instructing it NOT to re-confirm them. The analyst focuses classification on new clip patterns not yet accepted.</w:t>
+      </w:r>
+    </w:p>
+    <w:p>
+      <w:pPr>
+        <w:pStyle w:val="ListBullet"/>
+      </w:pPr>
+      <w:r>
+        <w:t>The Guidance Specialist sets action='complete' only when a NEWLY confirmed shunt_type is NOT already in accepted_shunts. If the confirmed type is already accepted, it outputs action='move' — the surgeon is still scanning.</w:t>
+      </w:r>
+    </w:p>
+    <w:p>
+      <w:pPr>
+        <w:pStyle w:val="ListBullet"/>
+      </w:pPr>
+      <w:r>
+        <w:t>The Circuit Analyst routing treats a previously accepted shunt as irrelevant to the current routing decision — it determines routing from the Q-state alone, not from which shunts were accepted.</w:t>
+      </w:r>
+    </w:p>
+    <w:p>
+      <w:pPr>
+        <w:ind w:left="567"/>
+      </w:pPr>
+      <w:r>
+        <w:rPr>
+          <w:rFonts w:ascii="Courier New" w:hAnsi="Courier New"/>
+          <w:sz w:val="16"/>
+        </w:rPr>
+        <w:t># crew_pipeline.py — Guidance Specialist task5 action logic</w:t>
+      </w:r>
+      <w:r>
+        <w:rPr>
+          <w:rFonts w:ascii="Courier New" w:hAnsi="Courier New"/>
+          <w:sz w:val="16"/>
+        </w:rPr>
+        <w:br/>
+        <w:t>action:</w:t>
+      </w:r>
+      <w:r>
+        <w:rPr>
+          <w:rFonts w:ascii="Courier New" w:hAnsi="Courier New"/>
+          <w:sz w:val="16"/>
+        </w:rPr>
+        <w:br/>
+      </w:r>
+      <w:r>
+        <w:rPr>
+          <w:rFonts w:ascii="Courier New" w:hAnsi="Courier New"/>
+          <w:sz w:val="16"/>
+        </w:rPr>
+        <w:lastRenderedPageBreak/>
+        <w:t xml:space="preserve">  complete  — if confirmed=true AND shunt_type NOT in accepted_shunts</w:t>
+      </w:r>
+      <w:r>
+        <w:rPr>
+          <w:rFonts w:ascii="Courier New" w:hAnsi="Courier New"/>
+          <w:sz w:val="16"/>
+        </w:rPr>
+        <w:br/>
+        <w:t xml:space="preserve">  maneuver  — if elim_required=true</w:t>
+      </w:r>
+      <w:r>
+        <w:rPr>
+          <w:rFonts w:ascii="Courier New" w:hAnsi="Courier New"/>
+          <w:sz w:val="16"/>
+        </w:rPr>
+        <w:br/>
+        <w:t xml:space="preserve">  move      — all other cases (including confirmed type already accepted)</w:t>
+      </w:r>
+    </w:p>
+    <w:p>
+      <w:pPr>
+        <w:pStyle w:val="Heading2"/>
+      </w:pPr>
+      <w:r>
+        <w:t>8.10  Navigation Planner Forbidden-Terms Rule</w:t>
+      </w:r>
+    </w:p>
+    <w:p>
+      <w:r>
+        <w:t>The surgeon reads the final guidance instruction while actively holding an ultrasound probe. Clinical reasoning terms such as Q1/Q2/Q3/Q4, EP, RP, N1/N2/N3, 'shunt', and 'circuit' are CHIVA protocol jargon that the surgeon already knows — they do not need to appear in a real-time navigation command. Including them wastes the 15-word limit and distracts from the anatomical movement instruction.</w:t>
+      </w:r>
+    </w:p>
+    <w:p>
+      <w:r>
+        <w:t>The Navigation Planner's task description contains an explicit forbidden list:</w:t>
+      </w:r>
+    </w:p>
+    <w:p>
+      <w:pPr>
+        <w:ind w:left="567"/>
+      </w:pPr>
+      <w:r>
+        <w:rPr>
+          <w:rFonts w:ascii="Courier New" w:hAnsi="Courier New"/>
+          <w:sz w:val="16"/>
+        </w:rPr>
+        <w:t>FORBIDDEN TERMS — must NOT appear anywhere in your output:</w:t>
+      </w:r>
+      <w:r>
+        <w:rPr>
+          <w:rFonts w:ascii="Courier New" w:hAnsi="Courier New"/>
+          <w:sz w:val="16"/>
+        </w:rPr>
+        <w:br/>
+        <w:t>Q1, Q2, Q3, Q4, corridor, EP, RP, N1, N2, N3, elimTest, elim,</w:t>
+      </w:r>
+      <w:r>
+        <w:rPr>
+          <w:rFonts w:ascii="Courier New" w:hAnsi="Courier New"/>
+          <w:sz w:val="16"/>
+        </w:rPr>
+        <w:br/>
+        <w:t>shunt, circuit, 'State A', 'State B', 'State C', 'State D', 'State E', 'State F'.</w:t>
+      </w:r>
+    </w:p>
+    <w:p>
+      <w:r>
+        <w:t>Every valid output starts with a movement verb ('Move') and contains a direction and a target that names both the anatomical structure AND its location on the leg. Examples of valid outputs:</w:t>
+      </w:r>
+    </w:p>
+    <w:p>
+      <w:pPr>
+        <w:pStyle w:val="ListBullet"/>
+      </w:pPr>
+      <w:r>
+        <w:t>'Move medially toward GSV in saphenous compartment at upper thigh'</w:t>
+      </w:r>
+    </w:p>
+    <w:p>
+      <w:pPr>
+        <w:pStyle w:val="ListBullet"/>
+      </w:pPr>
+      <w:r>
+        <w:t>'Move distally to Dodd perforator on medial distal thigh'</w:t>
+      </w:r>
+    </w:p>
+    <w:p>
+      <w:pPr>
+        <w:pStyle w:val="ListBullet"/>
+      </w:pPr>
+      <w:r>
+        <w:t>'Move posteriorly toward SPJ junction in popliteal fossa'</w:t>
+      </w:r>
+    </w:p>
+    <w:p>
+      <w:pPr>
+        <w:pStyle w:val="ListBullet"/>
+      </w:pPr>
+      <w:r>
+        <w:t>'Move medially toward GSV at medial malleolus (ankle)'</w:t>
+      </w:r>
+    </w:p>
+    <w:p>
+      <w:r>
+        <w:t>The Guidance Specialist copies this output into the JSON 'guidance' field. No additional summarisation or reformatting is performed. When action='maneuver', guidance is overridden to 'Perform elimination test at current zone'. When action='complete', guidance is overridden to 'Circuit complete — classification confirmed'.</w:t>
+      </w:r>
+    </w:p>
     <w:sectPr>
       <w:pgSz w:w="12240" w:h="15840"/>
       <w:pgMar w:top="1417" w:right="1417" w:bottom="1417" w:left="1701" w:header="720" w:footer="720" w:gutter="0"/>
@@ -14211,7 +15066,7 @@
 </file>
 
 <file path=word/numbering.xml><?xml version="1.0" encoding="utf-8"?>
-<w:numbering xmlns:wpc="http://schemas.microsoft.com/office/word/2010/wordprocessingCanvas" xmlns:cx="http://schemas.microsoft.com/office/drawing/2014/chartex" xmlns:cx1="http://schemas.microsoft.com/office/drawing/2015/9/8/chartex" xmlns:cx2="http://schemas.microsoft.com/office/drawing/2015/10/21/chartex" xmlns:cx3="http://schemas.microsoft.com/office/drawing/2016/5/9/chartex" xmlns:cx4="http://schemas.microsoft.com/office/drawing/2016/5/10/chartex" xmlns:cx5="http://schemas.microsoft.com/office/drawing/2016/5/11/chartex" xmlns:cx6="http://schemas.microsoft.com/office/drawing/2016/5/12/chartex" xmlns:cx7="http://schemas.microsoft.com/office/drawing/2016/5/13/chartex" xmlns:cx8="http://schemas.microsoft.com/office/drawing/2016/5/14/chartex" xmlns:mc="http://schemas.openxmlformats.org/markup-compatibility/2006" xmlns:aink="http://schemas.microsoft.com/office/drawing/2016/ink" xmlns:am3d="http://schemas.microsoft.com/office/drawing/2017/model3d" xmlns:o="urn:schemas-microsoft-com:office:office" xmlns:oel="http://schemas.microsoft.com/office/2019/extlst" xmlns:r="http://schemas.openxmlformats.org/officeDocument/2006/relationships" xmlns:m="http://schemas.openxmlformats.org/officeDocument/2006/math" xmlns:v="urn:schemas-microsoft-com:vml" xmlns:wp14="http://schemas.microsoft.com/office/word/2010/wordprocessingDrawing" xmlns:wp="http://schemas.openxmlformats.org/drawingml/2006/wordprocessingDrawing" xmlns:w10="urn:schemas-microsoft-com:office:word" xmlns:w="http://schemas.openxmlformats.org/wordprocessingml/2006/main" xmlns:w14="http://schemas.microsoft.com/office/word/2010/wordml" xmlns:w15="http://schemas.microsoft.com/office/word/2012/wordml" xmlns:w16cex="http://schemas.microsoft.com/office/word/2018/wordml/cex" xmlns:w16cid="http://schemas.microsoft.com/office/word/2016/wordml/cid" xmlns:w16="http://schemas.microsoft.com/office/word/2018/wordml" xmlns:w16du="http://schemas.microsoft.com/office/word/2023/wordml/word16du" xmlns:w16sdtdh="http://schemas.microsoft.com/office/word/2020/wordml/sdtdatahash" xmlns:w16sdtfl="http://schemas.microsoft.com/office/word/2024/wordml/sdtformatlock" xmlns:w16se="http://schemas.microsoft.com/office/word/2015/wordml/symex" xmlns:wpg="http://schemas.microsoft.com/office/word/2010/wordprocessingGroup" xmlns:wpi="http://schemas.microsoft.com/office/word/2010/wordprocessingInk" xmlns:wne="http://schemas.microsoft.com/office/word/2006/wordml" xmlns:wps="http://schemas.microsoft.com/office/word/2010/wordprocessingShape" mc:Ignorable="w14 w15 w16se w16cid w16 w16cex w16sdtdh w16sdtfl w16du wp14">
+<w:numbering xmlns:wpc="http://schemas.microsoft.com/office/word/2010/wordprocessingCanvas" xmlns:cx="http://schemas.microsoft.com/office/drawing/2014/chartex" xmlns:cx1="http://schemas.microsoft.com/office/drawing/2015/9/8/chartex" xmlns:cx2="http://schemas.microsoft.com/office/drawing/2015/10/21/chartex" xmlns:cx3="http://schemas.microsoft.com/office/drawing/2016/5/9/chartex" xmlns:cx4="http://schemas.microsoft.com/office/drawing/2016/5/10/chartex" xmlns:cx5="http://schemas.microsoft.com/office/drawing/2016/5/11/chartex" xmlns:cx6="http://schemas.microsoft.com/office/drawing/2016/5/12/chartex" xmlns:cx7="http://schemas.microsoft.com/office/drawing/2016/5/13/chartex" xmlns:cx8="http://schemas.microsoft.com/office/drawing/2016/5/14/chartex" xmlns:mc="http://schemas.openxmlformats.org/markup-compatibility/2006" xmlns:aink="http://schemas.microsoft.com/office/drawing/2016/ink" xmlns:am3d="http://schemas.microsoft.com/office/drawing/2017/model3d" xmlns:o="urn:schemas-microsoft-com:office:office" xmlns:oel="http://schemas.microsoft.com/office/2019/extlst" xmlns:r="http://schemas.openxmlformats.org/officeDocument/2006/relationships" xmlns:m="http://schemas.openxmlformats.org/officeDocument/2006/math" xmlns:v="urn:schemas-microsoft-com:vml" xmlns:wp14="http://schemas.microsoft.com/office/word/2010/wordprocessingDrawing" xmlns:wp="http://schemas.openxmlformats.org/drawingml/2006/wordprocessingDrawing" xmlns:w10="urn:schemas-microsoft-com:office:word" xmlns:w="http://schemas.openxmlformats.org/wordprocessingml/2006/main" xmlns:w14="http://schemas.microsoft.com/office/word/2010/wordml" xmlns:w15="http://schemas.microsoft.com/office/word/2012/wordml" xmlns:w16cei="http://schemas.microsoft.com/office/word/2026/wordml/cei" xmlns:w16cex="http://schemas.microsoft.com/office/word/2018/wordml/cex" xmlns:w16cid="http://schemas.microsoft.com/office/word/2016/wordml/cid" xmlns:w16="http://schemas.microsoft.com/office/word/2018/wordml" xmlns:w16du="http://schemas.microsoft.com/office/word/2023/wordml/word16du" xmlns:w16sdtdh="http://schemas.microsoft.com/office/word/2020/wordml/sdtdatahash" xmlns:w16sdtfl="http://schemas.microsoft.com/office/word/2024/wordml/sdtformatlock" xmlns:w16se="http://schemas.microsoft.com/office/word/2015/wordml/symex" xmlns:wpg="http://schemas.microsoft.com/office/word/2010/wordprocessingGroup" xmlns:wpi="http://schemas.microsoft.com/office/word/2010/wordprocessingInk" xmlns:wne="http://schemas.microsoft.com/office/word/2006/wordml" xmlns:wps="http://schemas.microsoft.com/office/word/2010/wordprocessingShape" mc:Ignorable="w14 w15 w16se w16cid w16 w16cex w16sdtdh w16sdtfl w16du wp14">
   <w:abstractNum w:abstractNumId="0" w15:restartNumberingAfterBreak="0">
     <w:nsid w:val="FFFFFF7C"/>
     <w:multiLevelType w:val="singleLevel"/>
@@ -15016,7 +15871,6 @@
   <w:style w:type="character" w:default="1" w:styleId="DefaultParagraphFont">
     <w:name w:val="Default Paragraph Font"/>
     <w:uiPriority w:val="1"/>
-    <w:semiHidden/>
     <w:unhideWhenUsed/>
   </w:style>
   <w:style w:type="table" w:default="1" w:styleId="TableNormal">

</xml_diff>